<commit_message>
Fix problem with pushing large data
</commit_message>
<xml_diff>
--- a/docs/dokumentacja.docx
+++ b/docs/dokumentacja.docx
@@ -135,6 +135,7 @@
           <w:bCs/>
           <w:sz w:val="28"/>
           <w:szCs w:val="28"/>
+          <w:lang w:val="pl-PL"/>
         </w:rPr>
       </w:pPr>
       <w:r>
@@ -149,6 +150,7 @@
         <w:rPr>
           <w:sz w:val="28"/>
           <w:szCs w:val="28"/>
+          <w:lang w:val="pl-PL"/>
         </w:rPr>
         <w:t>Kierunek:</w:t>
       </w:r>
@@ -156,6 +158,7 @@
         <w:rPr>
           <w:sz w:val="28"/>
           <w:szCs w:val="28"/>
+          <w:lang w:val="pl-PL"/>
         </w:rPr>
         <w:t xml:space="preserve"> </w:t>
       </w:r>
@@ -165,6 +168,7 @@
           <w:bCs/>
           <w:sz w:val="28"/>
           <w:szCs w:val="28"/>
+          <w:lang w:val="pl-PL"/>
         </w:rPr>
         <w:t>Informatyka</w:t>
       </w:r>
@@ -177,12 +181,14 @@
           <w:bCs/>
           <w:sz w:val="28"/>
           <w:szCs w:val="28"/>
+          <w:lang w:val="pl-PL"/>
         </w:rPr>
       </w:pPr>
       <w:r>
         <w:rPr>
           <w:sz w:val="28"/>
           <w:szCs w:val="28"/>
+          <w:lang w:val="pl-PL"/>
         </w:rPr>
         <w:t>Specjalność:</w:t>
       </w:r>
@@ -190,18 +196,22 @@
         <w:rPr>
           <w:sz w:val="28"/>
           <w:szCs w:val="28"/>
+          <w:lang w:val="pl-PL"/>
         </w:rPr>
         <w:t xml:space="preserve"> </w:t>
       </w:r>
+      <w:proofErr w:type="spellStart"/>
       <w:r>
         <w:rPr>
           <w:b/>
           <w:bCs/>
           <w:sz w:val="28"/>
           <w:szCs w:val="28"/>
+          <w:lang w:val="pl-PL"/>
         </w:rPr>
         <w:t>Cyberbezpieczeństwo</w:t>
       </w:r>
+      <w:proofErr w:type="spellEnd"/>
     </w:p>
     <w:p>
       <w:pPr>
@@ -211,12 +221,14 @@
           <w:bCs/>
           <w:sz w:val="28"/>
           <w:szCs w:val="28"/>
+          <w:lang w:val="pl-PL"/>
         </w:rPr>
       </w:pPr>
       <w:r>
         <w:rPr>
           <w:sz w:val="28"/>
           <w:szCs w:val="28"/>
+          <w:lang w:val="pl-PL"/>
         </w:rPr>
         <w:t>Tryb studiów</w:t>
       </w:r>
@@ -224,6 +236,7 @@
         <w:rPr>
           <w:sz w:val="28"/>
           <w:szCs w:val="28"/>
+          <w:lang w:val="pl-PL"/>
         </w:rPr>
         <w:t xml:space="preserve">: </w:t>
       </w:r>
@@ -233,6 +246,7 @@
           <w:bCs/>
           <w:sz w:val="28"/>
           <w:szCs w:val="28"/>
+          <w:lang w:val="pl-PL"/>
         </w:rPr>
         <w:t>niestacjonarny</w:t>
       </w:r>
@@ -244,6 +258,7 @@
           <w:b/>
           <w:sz w:val="28"/>
           <w:szCs w:val="28"/>
+          <w:lang w:val="pl-PL"/>
         </w:rPr>
       </w:pPr>
       <w:r>
@@ -251,6 +266,7 @@
           <w:bCs/>
           <w:sz w:val="28"/>
           <w:szCs w:val="28"/>
+          <w:lang w:val="pl-PL"/>
         </w:rPr>
         <w:t>Poziom studiów:</w:t>
       </w:r>
@@ -259,6 +275,7 @@
           <w:b/>
           <w:sz w:val="28"/>
           <w:szCs w:val="28"/>
+          <w:lang w:val="pl-PL"/>
         </w:rPr>
         <w:t xml:space="preserve"> </w:t>
       </w:r>
@@ -267,6 +284,7 @@
           <w:b/>
           <w:sz w:val="28"/>
           <w:szCs w:val="28"/>
+          <w:lang w:val="pl-PL"/>
         </w:rPr>
         <w:t>3 rok 1 semestr</w:t>
       </w:r>
@@ -290,7 +308,7 @@
           <w:szCs w:val="36"/>
           <w:lang w:val="pl-PL"/>
         </w:rPr>
-        <w:t>Przetwarzanie równoległe i rozproszone</w:t>
+        <w:t>Przetwarzanie równoległe i rozproszone -</w:t>
       </w:r>
       <w:r>
         <w:rPr>
@@ -300,7 +318,8 @@
           <w:szCs w:val="36"/>
           <w:lang w:val="pl-PL"/>
         </w:rPr>
-        <w:t xml:space="preserve"> -</w:t>
+        <w:br/>
+        <w:t>Implementacja rozproszonego systemu przetwarzania danych w modelu</w:t>
       </w:r>
       <w:r>
         <w:rPr>
@@ -311,8 +330,8 @@
           <w:lang w:val="pl-PL"/>
         </w:rPr>
         <w:br/>
-        <w:t>Implementacja rozproszonego systemu przetwarzania danych w modelu</w:t>
-      </w:r>
+      </w:r>
+      <w:proofErr w:type="spellStart"/>
       <w:r>
         <w:rPr>
           <w:b/>
@@ -321,9 +340,9 @@
           <w:szCs w:val="36"/>
           <w:lang w:val="pl-PL"/>
         </w:rPr>
-        <w:br/>
         <w:t>MapReduce</w:t>
       </w:r>
+      <w:proofErr w:type="spellEnd"/>
     </w:p>
     <w:p>
       <w:pPr>
@@ -333,17 +352,20 @@
           <w:b/>
           <w:bCs/>
           <w:szCs w:val="24"/>
+          <w:lang w:val="pl-PL"/>
         </w:rPr>
       </w:pPr>
       <w:r>
         <w:rPr>
           <w:szCs w:val="24"/>
+          <w:lang w:val="pl-PL"/>
         </w:rPr>
         <w:t>Autor</w:t>
       </w:r>
       <w:r>
         <w:rPr>
           <w:szCs w:val="24"/>
+          <w:lang w:val="pl-PL"/>
         </w:rPr>
         <w:t xml:space="preserve">: </w:t>
       </w:r>
@@ -352,6 +374,7 @@
           <w:b/>
           <w:bCs/>
           <w:szCs w:val="24"/>
+          <w:lang w:val="pl-PL"/>
         </w:rPr>
         <w:t xml:space="preserve">Paweł Pyrak </w:t>
       </w:r>
@@ -359,18 +382,21 @@
         <w:rPr>
           <w:b/>
           <w:szCs w:val="24"/>
+          <w:lang w:val="pl-PL"/>
         </w:rPr>
         <w:br/>
       </w:r>
       <w:r>
         <w:rPr>
           <w:szCs w:val="24"/>
+          <w:lang w:val="pl-PL"/>
         </w:rPr>
         <w:t>Nr albumu:</w:t>
       </w:r>
       <w:r>
         <w:rPr>
           <w:szCs w:val="24"/>
+          <w:lang w:val="pl-PL"/>
         </w:rPr>
         <w:t xml:space="preserve"> </w:t>
       </w:r>
@@ -379,6 +405,7 @@
           <w:b/>
           <w:bCs/>
           <w:szCs w:val="24"/>
+          <w:lang w:val="pl-PL"/>
         </w:rPr>
         <w:t>21790</w:t>
       </w:r>
@@ -397,6 +424,7 @@
       <w:r>
         <w:rPr>
           <w:rFonts w:cs="Arial"/>
+          <w:lang w:val="pl-PL"/>
         </w:rPr>
         <w:br w:type="page"/>
       </w:r>
@@ -405,41 +433,71 @@
           <w:rFonts w:cs="Arial"/>
         </w:rPr>
         <w:lastRenderedPageBreak/>
-        <w:t>Cel projektu</w:t>
-      </w:r>
-    </w:p>
-    <w:p>
-      <w:pPr>
-        <w:rPr>
-          <w:lang w:val="pl-PL"/>
-        </w:rPr>
-      </w:pPr>
-      <w:r>
-        <w:rPr>
-          <w:lang w:val="pl-PL"/>
-        </w:rPr>
-        <w:t>Celem projektu jest implementacja systemu rozproszonego przetwarzania danych w architekturze koordynator-worker z wykorzystaniem mechanizmów współbieżności.</w:t>
-      </w:r>
-    </w:p>
-    <w:p>
-      <w:pPr>
-        <w:rPr>
-          <w:lang w:val="pl-PL"/>
-        </w:rPr>
-      </w:pPr>
-    </w:p>
-    <w:p>
-      <w:pPr>
-        <w:rPr>
-          <w:lang w:val="pl-PL"/>
-        </w:rPr>
-      </w:pPr>
-      <w:r>
-        <w:rPr>
-          <w:lang w:val="pl-PL"/>
-        </w:rPr>
-        <w:t>System realizuje model Map Reduce</w:t>
-      </w:r>
+        <w:t xml:space="preserve">Cel </w:t>
+      </w:r>
+      <w:proofErr w:type="spellStart"/>
+      <w:r>
+        <w:rPr>
+          <w:rFonts w:cs="Arial"/>
+        </w:rPr>
+        <w:t>projektu</w:t>
+      </w:r>
+      <w:proofErr w:type="spellEnd"/>
+    </w:p>
+    <w:p>
+      <w:pPr>
+        <w:rPr>
+          <w:lang w:val="pl-PL"/>
+        </w:rPr>
+      </w:pPr>
+      <w:r>
+        <w:rPr>
+          <w:lang w:val="pl-PL"/>
+        </w:rPr>
+        <w:t>Celem projektu jest implementacja systemu rozproszonego przetwarzania danych w architekturze koordynator-</w:t>
+      </w:r>
+      <w:proofErr w:type="spellStart"/>
+      <w:r>
+        <w:rPr>
+          <w:lang w:val="pl-PL"/>
+        </w:rPr>
+        <w:t>worker</w:t>
+      </w:r>
+      <w:proofErr w:type="spellEnd"/>
+      <w:r>
+        <w:rPr>
+          <w:lang w:val="pl-PL"/>
+        </w:rPr>
+        <w:t xml:space="preserve"> z wykorzystaniem mechanizmów współbieżności.</w:t>
+      </w:r>
+    </w:p>
+    <w:p>
+      <w:pPr>
+        <w:rPr>
+          <w:lang w:val="pl-PL"/>
+        </w:rPr>
+      </w:pPr>
+    </w:p>
+    <w:p>
+      <w:pPr>
+        <w:rPr>
+          <w:lang w:val="pl-PL"/>
+        </w:rPr>
+      </w:pPr>
+      <w:r>
+        <w:rPr>
+          <w:lang w:val="pl-PL"/>
+        </w:rPr>
+        <w:t xml:space="preserve">System realizuje model Map </w:t>
+      </w:r>
+      <w:proofErr w:type="spellStart"/>
+      <w:r>
+        <w:rPr>
+          <w:lang w:val="pl-PL"/>
+        </w:rPr>
+        <w:t>Reduce</w:t>
+      </w:r>
+      <w:proofErr w:type="spellEnd"/>
       <w:r>
         <w:rPr>
           <w:lang w:val="pl-PL"/>
@@ -496,7 +554,21 @@
         <w:rPr>
           <w:lang w:val="pl-PL"/>
         </w:rPr>
-        <w:t>Projekt został zrealizowany w języku Python z wykorzystaniem:</w:t>
+        <w:t xml:space="preserve">Projekt został zrealizowany w języku </w:t>
+      </w:r>
+      <w:proofErr w:type="spellStart"/>
+      <w:r>
+        <w:rPr>
+          <w:lang w:val="pl-PL"/>
+        </w:rPr>
+        <w:t>Python</w:t>
+      </w:r>
+      <w:proofErr w:type="spellEnd"/>
+      <w:r>
+        <w:rPr>
+          <w:lang w:val="pl-PL"/>
+        </w:rPr>
+        <w:t xml:space="preserve"> z wykorzystaniem:</w:t>
       </w:r>
     </w:p>
     <w:p>
@@ -529,12 +601,28 @@
           <w:lang w:val="pl-PL"/>
         </w:rPr>
       </w:pPr>
-      <w:r>
-        <w:rPr>
-          <w:lang w:val="pl-PL"/>
-        </w:rPr>
-        <w:t>Socket – komunikacja TCP między koordynatorem a workerami</w:t>
-      </w:r>
+      <w:proofErr w:type="spellStart"/>
+      <w:r>
+        <w:rPr>
+          <w:lang w:val="pl-PL"/>
+        </w:rPr>
+        <w:t>Socket</w:t>
+      </w:r>
+      <w:proofErr w:type="spellEnd"/>
+      <w:r>
+        <w:rPr>
+          <w:lang w:val="pl-PL"/>
+        </w:rPr>
+        <w:t xml:space="preserve"> – komunikacja TCP między koordynatorem a </w:t>
+      </w:r>
+      <w:proofErr w:type="spellStart"/>
+      <w:r>
+        <w:rPr>
+          <w:lang w:val="pl-PL"/>
+        </w:rPr>
+        <w:t>workerami</w:t>
+      </w:r>
+      <w:proofErr w:type="spellEnd"/>
     </w:p>
     <w:p>
       <w:pPr>
@@ -546,11 +634,33 @@
           <w:lang w:val="pl-PL"/>
         </w:rPr>
       </w:pPr>
-      <w:r>
-        <w:rPr>
-          <w:lang w:val="pl-PL"/>
-        </w:rPr>
-        <w:t>Threading – obsługa workerów równolegle</w:t>
+      <w:proofErr w:type="spellStart"/>
+      <w:r>
+        <w:rPr>
+          <w:lang w:val="pl-PL"/>
+        </w:rPr>
+        <w:t>Threading</w:t>
+      </w:r>
+      <w:proofErr w:type="spellEnd"/>
+      <w:r>
+        <w:rPr>
+          <w:lang w:val="pl-PL"/>
+        </w:rPr>
+        <w:t xml:space="preserve"> – obsługa </w:t>
+      </w:r>
+      <w:proofErr w:type="spellStart"/>
+      <w:r>
+        <w:rPr>
+          <w:lang w:val="pl-PL"/>
+        </w:rPr>
+        <w:t>workerów</w:t>
+      </w:r>
+      <w:proofErr w:type="spellEnd"/>
+      <w:r>
+        <w:rPr>
+          <w:lang w:val="pl-PL"/>
+        </w:rPr>
+        <w:t xml:space="preserve"> równolegle</w:t>
       </w:r>
     </w:p>
     <w:p>
@@ -563,12 +673,28 @@
           <w:lang w:val="pl-PL"/>
         </w:rPr>
       </w:pPr>
-      <w:r>
-        <w:rPr>
-          <w:lang w:val="pl-PL"/>
-        </w:rPr>
-        <w:t>Multiprocessing – obsługa procesów workerów</w:t>
-      </w:r>
+      <w:proofErr w:type="spellStart"/>
+      <w:r>
+        <w:rPr>
+          <w:lang w:val="pl-PL"/>
+        </w:rPr>
+        <w:t>Multiprocessing</w:t>
+      </w:r>
+      <w:proofErr w:type="spellEnd"/>
+      <w:r>
+        <w:rPr>
+          <w:lang w:val="pl-PL"/>
+        </w:rPr>
+        <w:t xml:space="preserve"> – obsługa procesów </w:t>
+      </w:r>
+      <w:proofErr w:type="spellStart"/>
+      <w:r>
+        <w:rPr>
+          <w:lang w:val="pl-PL"/>
+        </w:rPr>
+        <w:t>workerów</w:t>
+      </w:r>
+      <w:proofErr w:type="spellEnd"/>
     </w:p>
     <w:p>
       <w:pPr>
@@ -597,11 +723,47 @@
           <w:lang w:val="pl-PL"/>
         </w:rPr>
       </w:pPr>
-      <w:r>
-        <w:rPr>
-          <w:lang w:val="pl-PL"/>
-        </w:rPr>
-        <w:t>Json – serializacja i deserializacja danych przesłanych przez sieć</w:t>
+      <w:proofErr w:type="spellStart"/>
+      <w:r>
+        <w:rPr>
+          <w:lang w:val="pl-PL"/>
+        </w:rPr>
+        <w:t>Json</w:t>
+      </w:r>
+      <w:proofErr w:type="spellEnd"/>
+      <w:r>
+        <w:rPr>
+          <w:lang w:val="pl-PL"/>
+        </w:rPr>
+        <w:t xml:space="preserve"> – </w:t>
+      </w:r>
+      <w:proofErr w:type="spellStart"/>
+      <w:r>
+        <w:rPr>
+          <w:lang w:val="pl-PL"/>
+        </w:rPr>
+        <w:t>serializacja</w:t>
+      </w:r>
+      <w:proofErr w:type="spellEnd"/>
+      <w:r>
+        <w:rPr>
+          <w:lang w:val="pl-PL"/>
+        </w:rPr>
+        <w:t xml:space="preserve"> i </w:t>
+      </w:r>
+      <w:proofErr w:type="spellStart"/>
+      <w:r>
+        <w:rPr>
+          <w:lang w:val="pl-PL"/>
+        </w:rPr>
+        <w:t>deserializacja</w:t>
+      </w:r>
+      <w:proofErr w:type="spellEnd"/>
+      <w:r>
+        <w:rPr>
+          <w:lang w:val="pl-PL"/>
+        </w:rPr>
+        <w:t xml:space="preserve"> danych przesłanych przez sieć</w:t>
       </w:r>
     </w:p>
     <w:p>
@@ -614,11 +776,19 @@
           <w:lang w:val="pl-PL"/>
         </w:rPr>
       </w:pPr>
-      <w:r>
-        <w:rPr>
-          <w:lang w:val="pl-PL"/>
-        </w:rPr>
-        <w:t>Pathlib – obsługa plików i ścieżek</w:t>
+      <w:proofErr w:type="spellStart"/>
+      <w:r>
+        <w:rPr>
+          <w:lang w:val="pl-PL"/>
+        </w:rPr>
+        <w:t>Pathlib</w:t>
+      </w:r>
+      <w:proofErr w:type="spellEnd"/>
+      <w:r>
+        <w:rPr>
+          <w:lang w:val="pl-PL"/>
+        </w:rPr>
+        <w:t xml:space="preserve"> – obsługa plików i ścieżek</w:t>
       </w:r>
     </w:p>
     <w:p>
@@ -631,11 +801,19 @@
           <w:lang w:val="pl-PL"/>
         </w:rPr>
       </w:pPr>
-      <w:r>
-        <w:rPr>
-          <w:lang w:val="pl-PL"/>
-        </w:rPr>
-        <w:t>Random – generowanie danych testowych</w:t>
+      <w:proofErr w:type="spellStart"/>
+      <w:r>
+        <w:rPr>
+          <w:lang w:val="pl-PL"/>
+        </w:rPr>
+        <w:t>Random</w:t>
+      </w:r>
+      <w:proofErr w:type="spellEnd"/>
+      <w:r>
+        <w:rPr>
+          <w:lang w:val="pl-PL"/>
+        </w:rPr>
+        <w:t xml:space="preserve"> – generowanie danych testowych</w:t>
       </w:r>
     </w:p>
     <w:p>
@@ -685,11 +863,19 @@
           <w:lang w:val="pl-PL"/>
         </w:rPr>
       </w:pPr>
-      <w:r>
-        <w:rPr>
-          <w:lang w:val="pl-PL"/>
-        </w:rPr>
-        <w:t>Python 3.x</w:t>
+      <w:proofErr w:type="spellStart"/>
+      <w:r>
+        <w:rPr>
+          <w:lang w:val="pl-PL"/>
+        </w:rPr>
+        <w:t>Python</w:t>
+      </w:r>
+      <w:proofErr w:type="spellEnd"/>
+      <w:r>
+        <w:rPr>
+          <w:lang w:val="pl-PL"/>
+        </w:rPr>
+        <w:t xml:space="preserve"> 3.x</w:t>
       </w:r>
     </w:p>
     <w:p>
@@ -852,8 +1038,16 @@
         <w:rPr>
           <w:lang w:val="pl-PL"/>
         </w:rPr>
-        <w:t>Uruchamianie workerów</w:t>
-      </w:r>
+        <w:t xml:space="preserve">Uruchamianie </w:t>
+      </w:r>
+      <w:proofErr w:type="spellStart"/>
+      <w:r>
+        <w:rPr>
+          <w:lang w:val="pl-PL"/>
+        </w:rPr>
+        <w:t>workerów</w:t>
+      </w:r>
+      <w:proofErr w:type="spellEnd"/>
     </w:p>
     <w:p>
       <w:pPr>
@@ -869,8 +1063,16 @@
         <w:rPr>
           <w:lang w:val="pl-PL"/>
         </w:rPr>
-        <w:t>Dystrybucję pracy do workerów</w:t>
-      </w:r>
+        <w:t xml:space="preserve">Dystrybucję pracy do </w:t>
+      </w:r>
+      <w:proofErr w:type="spellStart"/>
+      <w:r>
+        <w:rPr>
+          <w:lang w:val="pl-PL"/>
+        </w:rPr>
+        <w:t>workerów</w:t>
+      </w:r>
+      <w:proofErr w:type="spellEnd"/>
     </w:p>
     <w:p>
       <w:pPr>
@@ -886,7 +1088,35 @@
         <w:rPr>
           <w:lang w:val="pl-PL"/>
         </w:rPr>
-        <w:t>Odbieranie wyników od workerów przez sockety TCP</w:t>
+        <w:t xml:space="preserve">Odbieranie wyników od </w:t>
+      </w:r>
+      <w:proofErr w:type="spellStart"/>
+      <w:r>
+        <w:rPr>
+          <w:lang w:val="pl-PL"/>
+        </w:rPr>
+        <w:t>workerów</w:t>
+      </w:r>
+      <w:proofErr w:type="spellEnd"/>
+      <w:r>
+        <w:rPr>
+          <w:lang w:val="pl-PL"/>
+        </w:rPr>
+        <w:t xml:space="preserve"> przez </w:t>
+      </w:r>
+      <w:proofErr w:type="spellStart"/>
+      <w:r>
+        <w:rPr>
+          <w:lang w:val="pl-PL"/>
+        </w:rPr>
+        <w:t>sockety</w:t>
+      </w:r>
+      <w:proofErr w:type="spellEnd"/>
+      <w:r>
+        <w:rPr>
+          <w:lang w:val="pl-PL"/>
+        </w:rPr>
+        <w:t xml:space="preserve"> TCP</w:t>
       </w:r>
     </w:p>
     <w:p>
@@ -903,7 +1133,21 @@
         <w:rPr>
           <w:lang w:val="pl-PL"/>
         </w:rPr>
-        <w:t>Agregację wyników (faza reduce)</w:t>
+        <w:t xml:space="preserve">Agregację wyników (faza </w:t>
+      </w:r>
+      <w:proofErr w:type="spellStart"/>
+      <w:r>
+        <w:rPr>
+          <w:lang w:val="pl-PL"/>
+        </w:rPr>
+        <w:t>reduce</w:t>
+      </w:r>
+      <w:proofErr w:type="spellEnd"/>
+      <w:r>
+        <w:rPr>
+          <w:lang w:val="pl-PL"/>
+        </w:rPr>
+        <w:t>)</w:t>
       </w:r>
     </w:p>
     <w:p>
@@ -942,6 +1186,7 @@
           <w:rFonts w:cs="Arial"/>
         </w:rPr>
       </w:pPr>
+      <w:proofErr w:type="spellStart"/>
       <w:r>
         <w:rPr>
           <w:rFonts w:cs="Arial"/>
@@ -950,19 +1195,28 @@
         <w:lastRenderedPageBreak/>
         <w:t>Worker</w:t>
       </w:r>
-    </w:p>
-    <w:p>
-      <w:pPr>
-        <w:rPr>
-          <w:lang w:val="pl-PL"/>
-        </w:rPr>
-      </w:pPr>
-      <w:r>
-        <w:rPr>
-          <w:lang w:val="pl-PL"/>
-        </w:rPr>
-        <w:t>Każdy worker</w:t>
-      </w:r>
+      <w:proofErr w:type="spellEnd"/>
+    </w:p>
+    <w:p>
+      <w:pPr>
+        <w:rPr>
+          <w:lang w:val="pl-PL"/>
+        </w:rPr>
+      </w:pPr>
+      <w:r>
+        <w:rPr>
+          <w:lang w:val="pl-PL"/>
+        </w:rPr>
+        <w:t xml:space="preserve">Każdy </w:t>
+      </w:r>
+      <w:proofErr w:type="spellStart"/>
+      <w:r>
+        <w:rPr>
+          <w:lang w:val="pl-PL"/>
+        </w:rPr>
+        <w:t>worker</w:t>
+      </w:r>
+      <w:proofErr w:type="spellEnd"/>
       <w:r>
         <w:rPr>
           <w:lang w:val="pl-PL"/>
@@ -1081,12 +1335,28 @@
           <w:lang w:val="pl-PL"/>
         </w:rPr>
       </w:pPr>
-      <w:r>
-        <w:rPr>
-          <w:lang w:val="pl-PL"/>
-        </w:rPr>
-        <w:t>total time</w:t>
-      </w:r>
+      <w:proofErr w:type="spellStart"/>
+      <w:r>
+        <w:rPr>
+          <w:lang w:val="pl-PL"/>
+        </w:rPr>
+        <w:t>total</w:t>
+      </w:r>
+      <w:proofErr w:type="spellEnd"/>
+      <w:r>
+        <w:rPr>
+          <w:lang w:val="pl-PL"/>
+        </w:rPr>
+        <w:t xml:space="preserve"> </w:t>
+      </w:r>
+      <w:proofErr w:type="spellStart"/>
+      <w:r>
+        <w:rPr>
+          <w:lang w:val="pl-PL"/>
+        </w:rPr>
+        <w:t>time</w:t>
+      </w:r>
+      <w:proofErr w:type="spellEnd"/>
     </w:p>
     <w:p>
       <w:pPr>
@@ -1102,8 +1372,16 @@
         <w:rPr>
           <w:lang w:val="pl-PL"/>
         </w:rPr>
-        <w:t>map time</w:t>
-      </w:r>
+        <w:t xml:space="preserve">map </w:t>
+      </w:r>
+      <w:proofErr w:type="spellStart"/>
+      <w:r>
+        <w:rPr>
+          <w:lang w:val="pl-PL"/>
+        </w:rPr>
+        <w:t>time</w:t>
+      </w:r>
+      <w:proofErr w:type="spellEnd"/>
     </w:p>
     <w:p>
       <w:pPr>
@@ -1115,12 +1393,28 @@
           <w:lang w:val="pl-PL"/>
         </w:rPr>
       </w:pPr>
-      <w:r>
-        <w:rPr>
-          <w:lang w:val="pl-PL"/>
-        </w:rPr>
-        <w:t>reduce time</w:t>
-      </w:r>
+      <w:proofErr w:type="spellStart"/>
+      <w:r>
+        <w:rPr>
+          <w:lang w:val="pl-PL"/>
+        </w:rPr>
+        <w:t>reduce</w:t>
+      </w:r>
+      <w:proofErr w:type="spellEnd"/>
+      <w:r>
+        <w:rPr>
+          <w:lang w:val="pl-PL"/>
+        </w:rPr>
+        <w:t xml:space="preserve"> </w:t>
+      </w:r>
+      <w:proofErr w:type="spellStart"/>
+      <w:r>
+        <w:rPr>
+          <w:lang w:val="pl-PL"/>
+        </w:rPr>
+        <w:t>time</w:t>
+      </w:r>
+      <w:proofErr w:type="spellEnd"/>
     </w:p>
     <w:p>
       <w:pPr>
@@ -1132,12 +1426,14 @@
           <w:lang w:val="pl-PL"/>
         </w:rPr>
       </w:pPr>
+      <w:proofErr w:type="spellStart"/>
       <w:r>
         <w:rPr>
           <w:lang w:val="pl-PL"/>
         </w:rPr>
         <w:t>speedup</w:t>
       </w:r>
+      <w:proofErr w:type="spellEnd"/>
     </w:p>
     <w:p>
       <w:pPr>
@@ -1149,12 +1445,14 @@
           <w:lang w:val="pl-PL"/>
         </w:rPr>
       </w:pPr>
+      <w:proofErr w:type="spellStart"/>
       <w:r>
         <w:rPr>
           <w:lang w:val="pl-PL"/>
         </w:rPr>
         <w:t>efficiency</w:t>
       </w:r>
+      <w:proofErr w:type="spellEnd"/>
     </w:p>
     <w:p>
       <w:pPr>
@@ -1250,7 +1548,21 @@
         <w:rPr>
           <w:lang w:val="pl-PL"/>
         </w:rPr>
-        <w:t xml:space="preserve">Wersję równoległą wykonuje na różnej ilości workerów (1, 2, 4) </w:t>
+        <w:t xml:space="preserve">Wersję równoległą wykonuje na różnej ilości </w:t>
+      </w:r>
+      <w:proofErr w:type="spellStart"/>
+      <w:r>
+        <w:rPr>
+          <w:lang w:val="pl-PL"/>
+        </w:rPr>
+        <w:t>workerów</w:t>
+      </w:r>
+      <w:proofErr w:type="spellEnd"/>
+      <w:r>
+        <w:rPr>
+          <w:lang w:val="pl-PL"/>
+        </w:rPr>
+        <w:t xml:space="preserve"> (1, 2, 4) </w:t>
       </w:r>
     </w:p>
     <w:p>
@@ -1267,7 +1579,21 @@
         <w:rPr>
           <w:lang w:val="pl-PL"/>
         </w:rPr>
-        <w:t>Wykonuje każdy dataset trzykrotnie</w:t>
+        <w:t xml:space="preserve">Wykonuje każdy </w:t>
+      </w:r>
+      <w:proofErr w:type="spellStart"/>
+      <w:r>
+        <w:rPr>
+          <w:lang w:val="pl-PL"/>
+        </w:rPr>
+        <w:t>dataset</w:t>
+      </w:r>
+      <w:proofErr w:type="spellEnd"/>
+      <w:r>
+        <w:rPr>
+          <w:lang w:val="pl-PL"/>
+        </w:rPr>
+        <w:t xml:space="preserve"> trzykrotnie</w:t>
       </w:r>
     </w:p>
     <w:p>
@@ -1290,8 +1616,30 @@
         <w:rPr>
           <w:lang w:val="pl-PL"/>
         </w:rPr>
-        <w:t>, speedup i efficiency</w:t>
-      </w:r>
+        <w:t xml:space="preserve">, </w:t>
+      </w:r>
+      <w:proofErr w:type="spellStart"/>
+      <w:r>
+        <w:rPr>
+          <w:lang w:val="pl-PL"/>
+        </w:rPr>
+        <w:t>speedup</w:t>
+      </w:r>
+      <w:proofErr w:type="spellEnd"/>
+      <w:r>
+        <w:rPr>
+          <w:lang w:val="pl-PL"/>
+        </w:rPr>
+        <w:t xml:space="preserve"> i </w:t>
+      </w:r>
+      <w:proofErr w:type="spellStart"/>
+      <w:r>
+        <w:rPr>
+          <w:lang w:val="pl-PL"/>
+        </w:rPr>
+        <w:t>efficiency</w:t>
+      </w:r>
+      <w:proofErr w:type="spellEnd"/>
     </w:p>
     <w:p>
       <w:pPr>
@@ -1327,7 +1675,23 @@
           <w:rFonts w:cs="Arial"/>
           <w:lang w:val="pl-PL"/>
         </w:rPr>
-        <w:t>Model przetwarzania (MapReduce)</w:t>
+        <w:t>Model przetwarzania (</w:t>
+      </w:r>
+      <w:proofErr w:type="spellStart"/>
+      <w:r>
+        <w:rPr>
+          <w:rFonts w:cs="Arial"/>
+          <w:lang w:val="pl-PL"/>
+        </w:rPr>
+        <w:t>MapReduce</w:t>
+      </w:r>
+      <w:proofErr w:type="spellEnd"/>
+      <w:r>
+        <w:rPr>
+          <w:rFonts w:cs="Arial"/>
+          <w:lang w:val="pl-PL"/>
+        </w:rPr>
+        <w:t>)</w:t>
       </w:r>
     </w:p>
     <w:p>
@@ -1360,7 +1724,21 @@
         <w:rPr>
           <w:lang w:val="pl-PL"/>
         </w:rPr>
-        <w:t>Każdy worker:</w:t>
+        <w:t xml:space="preserve">Każdy </w:t>
+      </w:r>
+      <w:proofErr w:type="spellStart"/>
+      <w:r>
+        <w:rPr>
+          <w:lang w:val="pl-PL"/>
+        </w:rPr>
+        <w:t>worker</w:t>
+      </w:r>
+      <w:proofErr w:type="spellEnd"/>
+      <w:r>
+        <w:rPr>
+          <w:lang w:val="pl-PL"/>
+        </w:rPr>
+        <w:t>:</w:t>
       </w:r>
     </w:p>
     <w:p>
@@ -1457,8 +1835,16 @@
         <w:rPr>
           <w:lang w:val="pl-PL"/>
         </w:rPr>
-        <w:t>Zamienia wszystkie znaki do lowercase</w:t>
-      </w:r>
+        <w:t xml:space="preserve">Zamienia wszystkie znaki do </w:t>
+      </w:r>
+      <w:proofErr w:type="spellStart"/>
+      <w:r>
+        <w:rPr>
+          <w:lang w:val="pl-PL"/>
+        </w:rPr>
+        <w:t>lowercase</w:t>
+      </w:r>
+      <w:proofErr w:type="spellEnd"/>
     </w:p>
     <w:p>
       <w:pPr>
@@ -1487,19 +1873,39 @@
           <w:lang w:val="pl-PL"/>
         </w:rPr>
       </w:pPr>
-      <w:r>
-        <w:rPr>
-          <w:lang w:val="pl-PL"/>
-        </w:rPr>
-        <w:t xml:space="preserve">Tokenizuje przy użyciu funkcji </w:t>
-      </w:r>
+      <w:proofErr w:type="spellStart"/>
+      <w:r>
+        <w:rPr>
+          <w:lang w:val="pl-PL"/>
+        </w:rPr>
+        <w:t>Tokenizuje</w:t>
+      </w:r>
+      <w:proofErr w:type="spellEnd"/>
+      <w:r>
+        <w:rPr>
+          <w:lang w:val="pl-PL"/>
+        </w:rPr>
+        <w:t xml:space="preserve"> przy użyciu funkcji </w:t>
+      </w:r>
+      <w:proofErr w:type="spellStart"/>
+      <w:proofErr w:type="gramStart"/>
       <w:r>
         <w:rPr>
           <w:b/>
           <w:bCs/>
           <w:lang w:val="pl-PL"/>
         </w:rPr>
-        <w:t>text.split()</w:t>
+        <w:t>text.split</w:t>
+      </w:r>
+      <w:proofErr w:type="spellEnd"/>
+      <w:proofErr w:type="gramEnd"/>
+      <w:r>
+        <w:rPr>
+          <w:b/>
+          <w:bCs/>
+          <w:lang w:val="pl-PL"/>
+        </w:rPr>
+        <w:t>()</w:t>
       </w:r>
     </w:p>
     <w:p>
@@ -1516,7 +1922,35 @@
         <w:rPr>
           <w:lang w:val="pl-PL"/>
         </w:rPr>
-        <w:t>Usuwa tokeny będące tylko liczbami ale pozostawia ciągli alfanumeryczne</w:t>
+        <w:t xml:space="preserve">Usuwa </w:t>
+      </w:r>
+      <w:proofErr w:type="spellStart"/>
+      <w:r>
+        <w:rPr>
+          <w:lang w:val="pl-PL"/>
+        </w:rPr>
+        <w:t>tokeny</w:t>
+      </w:r>
+      <w:proofErr w:type="spellEnd"/>
+      <w:r>
+        <w:rPr>
+          <w:lang w:val="pl-PL"/>
+        </w:rPr>
+        <w:t xml:space="preserve"> będące tylko </w:t>
+      </w:r>
+      <w:proofErr w:type="gramStart"/>
+      <w:r>
+        <w:rPr>
+          <w:lang w:val="pl-PL"/>
+        </w:rPr>
+        <w:t>liczbami</w:t>
+      </w:r>
+      <w:proofErr w:type="gramEnd"/>
+      <w:r>
+        <w:rPr>
+          <w:lang w:val="pl-PL"/>
+        </w:rPr>
+        <w:t xml:space="preserve"> ale pozostawia ciągli alfanumeryczne</w:t>
       </w:r>
     </w:p>
     <w:p>
@@ -1587,8 +2021,17 @@
           <w:lang w:val="pl-PL"/>
         </w:rPr>
         <w:lastRenderedPageBreak/>
-        <w:t>Faza Reduce</w:t>
-      </w:r>
+        <w:t xml:space="preserve">Faza </w:t>
+      </w:r>
+      <w:proofErr w:type="spellStart"/>
+      <w:r>
+        <w:rPr>
+          <w:rFonts w:cs="Arial"/>
+          <w:lang w:val="pl-PL"/>
+        </w:rPr>
+        <w:t>Reduce</w:t>
+      </w:r>
+      <w:proofErr w:type="spellEnd"/>
     </w:p>
     <w:p>
       <w:pPr>
@@ -1617,8 +2060,16 @@
         <w:rPr>
           <w:lang w:val="pl-PL"/>
         </w:rPr>
-        <w:t>Odbiera słowniki od workerów</w:t>
-      </w:r>
+        <w:t xml:space="preserve">Odbiera słowniki od </w:t>
+      </w:r>
+      <w:proofErr w:type="spellStart"/>
+      <w:r>
+        <w:rPr>
+          <w:lang w:val="pl-PL"/>
+        </w:rPr>
+        <w:t>workerów</w:t>
+      </w:r>
+      <w:proofErr w:type="spellEnd"/>
     </w:p>
     <w:p>
       <w:pPr>
@@ -1905,7 +2356,21 @@
         <w:rPr>
           <w:lang w:val="pl-PL"/>
         </w:rPr>
-        <w:t>Czas całkowity (total_time)</w:t>
+        <w:t>Czas całkowity (</w:t>
+      </w:r>
+      <w:proofErr w:type="spellStart"/>
+      <w:r>
+        <w:rPr>
+          <w:lang w:val="pl-PL"/>
+        </w:rPr>
+        <w:t>total_time</w:t>
+      </w:r>
+      <w:proofErr w:type="spellEnd"/>
+      <w:r>
+        <w:rPr>
+          <w:lang w:val="pl-PL"/>
+        </w:rPr>
+        <w:t>)</w:t>
       </w:r>
     </w:p>
     <w:p>
@@ -1939,8 +2404,16 @@
         <w:rPr>
           <w:lang w:val="pl-PL"/>
         </w:rPr>
-        <w:t>Czas fazy Reduce</w:t>
-      </w:r>
+        <w:t xml:space="preserve">Czas fazy </w:t>
+      </w:r>
+      <w:proofErr w:type="spellStart"/>
+      <w:r>
+        <w:rPr>
+          <w:lang w:val="pl-PL"/>
+        </w:rPr>
+        <w:t>Reduce</w:t>
+      </w:r>
+      <w:proofErr w:type="spellEnd"/>
     </w:p>
     <w:p>
       <w:pPr>
@@ -1959,7 +2432,23 @@
           <w:rFonts w:cs="Arial"/>
           <w:lang w:val="pl-PL"/>
         </w:rPr>
-        <w:t>Przyspieszenie (Speedup)</w:t>
+        <w:t>Przyspieszenie (</w:t>
+      </w:r>
+      <w:proofErr w:type="spellStart"/>
+      <w:r>
+        <w:rPr>
+          <w:rFonts w:cs="Arial"/>
+          <w:lang w:val="pl-PL"/>
+        </w:rPr>
+        <w:t>Speedup</w:t>
+      </w:r>
+      <w:proofErr w:type="spellEnd"/>
+      <w:r>
+        <w:rPr>
+          <w:rFonts w:cs="Arial"/>
+          <w:lang w:val="pl-PL"/>
+        </w:rPr>
+        <w:t>)</w:t>
       </w:r>
     </w:p>
     <w:p>
@@ -1996,6 +2485,7 @@
         </w:rPr>
         <w:t xml:space="preserve">Speedup = </w:t>
       </w:r>
+      <w:proofErr w:type="spellStart"/>
       <w:r>
         <w:rPr>
           <w:b/>
@@ -2008,22 +2498,32 @@
           <w:b/>
           <w:bCs/>
         </w:rPr>
-        <w:t xml:space="preserve">ime_seq / </w:t>
-      </w:r>
+        <w:t>ime_seq</w:t>
+      </w:r>
+      <w:proofErr w:type="spellEnd"/>
       <w:r>
         <w:rPr>
           <w:b/>
           <w:bCs/>
         </w:rPr>
-        <w:t>T</w:t>
-      </w:r>
+        <w:t xml:space="preserve"> / </w:t>
+      </w:r>
+      <w:proofErr w:type="spellStart"/>
       <w:r>
         <w:rPr>
           <w:b/>
           <w:bCs/>
         </w:rPr>
+        <w:t>T</w:t>
+      </w:r>
+      <w:r>
+        <w:rPr>
+          <w:b/>
+          <w:bCs/>
+        </w:rPr>
         <w:t>ime_par</w:t>
       </w:r>
+      <w:proofErr w:type="spellEnd"/>
     </w:p>
     <w:p>
       <w:pPr>
@@ -2047,7 +2547,23 @@
           <w:rFonts w:cs="Arial"/>
           <w:lang w:val="pl-PL"/>
         </w:rPr>
-        <w:t>Efektywność (Efficiency)</w:t>
+        <w:t>Efektywność (</w:t>
+      </w:r>
+      <w:proofErr w:type="spellStart"/>
+      <w:r>
+        <w:rPr>
+          <w:rFonts w:cs="Arial"/>
+          <w:lang w:val="pl-PL"/>
+        </w:rPr>
+        <w:t>Efficiency</w:t>
+      </w:r>
+      <w:proofErr w:type="spellEnd"/>
+      <w:r>
+        <w:rPr>
+          <w:rFonts w:cs="Arial"/>
+          <w:lang w:val="pl-PL"/>
+        </w:rPr>
+        <w:t>)</w:t>
       </w:r>
     </w:p>
     <w:p>
@@ -2078,49 +2594,87 @@
           <w:lang w:val="pl-PL"/>
         </w:rPr>
       </w:pPr>
+      <w:proofErr w:type="spellStart"/>
       <w:r>
         <w:rPr>
           <w:b/>
           <w:bCs/>
           <w:lang w:val="pl-PL"/>
         </w:rPr>
-        <w:t>Efficiency = Speedup / liczba_workerów</w:t>
-      </w:r>
-    </w:p>
-    <w:p>
-      <w:pPr>
+        <w:t>Efficiency</w:t>
+      </w:r>
+      <w:proofErr w:type="spellEnd"/>
+      <w:r>
         <w:rPr>
           <w:b/>
           <w:bCs/>
           <w:lang w:val="pl-PL"/>
         </w:rPr>
-      </w:pPr>
-    </w:p>
-    <w:p>
-      <w:pPr>
+        <w:t xml:space="preserve"> = </w:t>
+      </w:r>
+      <w:proofErr w:type="spellStart"/>
+      <w:r>
         <w:rPr>
           <w:b/>
           <w:bCs/>
           <w:lang w:val="pl-PL"/>
         </w:rPr>
-      </w:pPr>
-    </w:p>
-    <w:p>
-      <w:pPr>
+        <w:t>Speedup</w:t>
+      </w:r>
+      <w:proofErr w:type="spellEnd"/>
+      <w:r>
         <w:rPr>
           <w:b/>
           <w:bCs/>
           <w:lang w:val="pl-PL"/>
         </w:rPr>
-      </w:pPr>
-    </w:p>
-    <w:p>
-      <w:pPr>
+        <w:t xml:space="preserve"> / </w:t>
+      </w:r>
+      <w:proofErr w:type="spellStart"/>
+      <w:r>
         <w:rPr>
           <w:b/>
           <w:bCs/>
           <w:lang w:val="pl-PL"/>
         </w:rPr>
+        <w:t>liczba_workerów</w:t>
+      </w:r>
+      <w:proofErr w:type="spellEnd"/>
+    </w:p>
+    <w:p>
+      <w:pPr>
+        <w:rPr>
+          <w:b/>
+          <w:bCs/>
+          <w:lang w:val="pl-PL"/>
+        </w:rPr>
+      </w:pPr>
+    </w:p>
+    <w:p>
+      <w:pPr>
+        <w:rPr>
+          <w:b/>
+          <w:bCs/>
+          <w:lang w:val="pl-PL"/>
+        </w:rPr>
+      </w:pPr>
+    </w:p>
+    <w:p>
+      <w:pPr>
+        <w:rPr>
+          <w:b/>
+          <w:bCs/>
+          <w:lang w:val="pl-PL"/>
+        </w:rPr>
+      </w:pPr>
+    </w:p>
+    <w:p>
+      <w:pPr>
+        <w:rPr>
+          <w:b/>
+          <w:bCs/>
+          <w:lang w:val="pl-PL"/>
+        </w:rPr>
       </w:pPr>
     </w:p>
     <w:p>
@@ -2188,7 +2742,21 @@
         <w:rPr>
           <w:lang w:val="pl-PL"/>
         </w:rPr>
-        <w:t>Wpływ liczby workerów na czas wykonania</w:t>
+        <w:t xml:space="preserve">Wpływ liczby </w:t>
+      </w:r>
+      <w:proofErr w:type="spellStart"/>
+      <w:r>
+        <w:rPr>
+          <w:lang w:val="pl-PL"/>
+        </w:rPr>
+        <w:t>workerów</w:t>
+      </w:r>
+      <w:proofErr w:type="spellEnd"/>
+      <w:r>
+        <w:rPr>
+          <w:lang w:val="pl-PL"/>
+        </w:rPr>
+        <w:t xml:space="preserve"> na czas wykonania</w:t>
       </w:r>
     </w:p>
     <w:p>
@@ -2248,17 +2816,38 @@
         <w:rPr>
           <w:lang w:val="pl-PL"/>
         </w:rPr>
-        <w:t>Small dataset</w:t>
-      </w:r>
-    </w:p>
-    <w:p>
-      <w:r>
-        <w:t>Dataset: data/small_dataset</w:t>
-      </w:r>
-    </w:p>
-    <w:p>
-      <w:r>
-        <w:t>Average results for 3 passes of sequential and parallel (with 1, 2 and 4 workers) MAP REDUCE algorithm.</w:t>
+        <w:t xml:space="preserve">Small </w:t>
+      </w:r>
+      <w:proofErr w:type="spellStart"/>
+      <w:r>
+        <w:rPr>
+          <w:lang w:val="pl-PL"/>
+        </w:rPr>
+        <w:t>dataset</w:t>
+      </w:r>
+      <w:proofErr w:type="spellEnd"/>
+    </w:p>
+    <w:p>
+      <w:r>
+        <w:t>Dataset: data/</w:t>
+      </w:r>
+      <w:proofErr w:type="spellStart"/>
+      <w:r>
+        <w:t>small_dataset</w:t>
+      </w:r>
+      <w:proofErr w:type="spellEnd"/>
+    </w:p>
+    <w:p>
+      <w:r>
+        <w:t xml:space="preserve">Average results for 3 </w:t>
+      </w:r>
+      <w:proofErr w:type="gramStart"/>
+      <w:r>
+        <w:t>passes of sequential and parallel</w:t>
+      </w:r>
+      <w:proofErr w:type="gramEnd"/>
+      <w:r>
+        <w:t xml:space="preserve"> (with 1, 2 and 4 workers) MAP REDUCE algorithm.</w:t>
       </w:r>
     </w:p>
     <w:p/>
@@ -2280,7 +2869,15 @@
     </w:p>
     <w:p>
       <w:r>
-        <w:t>Reduce:  0.0003s</w:t>
+        <w:t>Reduce</w:t>
+      </w:r>
+      <w:proofErr w:type="gramStart"/>
+      <w:r>
+        <w:t>:  0.0003</w:t>
+      </w:r>
+      <w:proofErr w:type="gramEnd"/>
+      <w:r>
+        <w:t>s</w:t>
       </w:r>
     </w:p>
     <w:p/>
@@ -2297,17 +2894,41 @@
     </w:p>
     <w:p>
       <w:r>
-        <w:t>Total:   0.5344s  (Speedup: 0.51x)</w:t>
-      </w:r>
-    </w:p>
-    <w:p>
-      <w:r>
-        <w:t>Map:     0.2690s  (Speedup: 1.00x)</w:t>
-      </w:r>
-    </w:p>
-    <w:p>
-      <w:r>
-        <w:t>Reduce:  0.0003s  (Speedup: 1.10x)</w:t>
+        <w:t xml:space="preserve">Total:   </w:t>
+      </w:r>
+      <w:proofErr w:type="gramStart"/>
+      <w:r>
+        <w:t>0.5344s  (</w:t>
+      </w:r>
+      <w:proofErr w:type="gramEnd"/>
+      <w:r>
+        <w:t>Speedup: 0.51x)</w:t>
+      </w:r>
+    </w:p>
+    <w:p>
+      <w:r>
+        <w:t xml:space="preserve">Map:     </w:t>
+      </w:r>
+      <w:proofErr w:type="gramStart"/>
+      <w:r>
+        <w:t>0.2690s  (</w:t>
+      </w:r>
+      <w:proofErr w:type="gramEnd"/>
+      <w:r>
+        <w:t>Speedup: 1.00x)</w:t>
+      </w:r>
+    </w:p>
+    <w:p>
+      <w:r>
+        <w:t xml:space="preserve">Reduce:  </w:t>
+      </w:r>
+      <w:proofErr w:type="gramStart"/>
+      <w:r>
+        <w:t>0.0003s  (</w:t>
+      </w:r>
+      <w:proofErr w:type="gramEnd"/>
+      <w:r>
+        <w:t>Speedup: 1.10x)</w:t>
       </w:r>
     </w:p>
     <w:p>
@@ -2323,17 +2944,41 @@
     </w:p>
     <w:p>
       <w:r>
-        <w:t>Total:   0.4234s  (Speedup: 0.64x)</w:t>
-      </w:r>
-    </w:p>
-    <w:p>
-      <w:r>
-        <w:t>Map:     0.1373s  (Speedup: 1.96x)</w:t>
-      </w:r>
-    </w:p>
-    <w:p>
-      <w:r>
-        <w:t>Reduce:  0.0003s  (Speedup: 1.04x)</w:t>
+        <w:t xml:space="preserve">Total:   </w:t>
+      </w:r>
+      <w:proofErr w:type="gramStart"/>
+      <w:r>
+        <w:t>0.4234s  (</w:t>
+      </w:r>
+      <w:proofErr w:type="gramEnd"/>
+      <w:r>
+        <w:t>Speedup: 0.64x)</w:t>
+      </w:r>
+    </w:p>
+    <w:p>
+      <w:r>
+        <w:t xml:space="preserve">Map:     </w:t>
+      </w:r>
+      <w:proofErr w:type="gramStart"/>
+      <w:r>
+        <w:t>0.1373s  (</w:t>
+      </w:r>
+      <w:proofErr w:type="gramEnd"/>
+      <w:r>
+        <w:t>Speedup: 1.96x)</w:t>
+      </w:r>
+    </w:p>
+    <w:p>
+      <w:r>
+        <w:t xml:space="preserve">Reduce:  </w:t>
+      </w:r>
+      <w:proofErr w:type="gramStart"/>
+      <w:r>
+        <w:t>0.0003s  (</w:t>
+      </w:r>
+      <w:proofErr w:type="gramEnd"/>
+      <w:r>
+        <w:t>Speedup: 1.04x)</w:t>
       </w:r>
     </w:p>
     <w:p>
@@ -2349,17 +2994,41 @@
     </w:p>
     <w:p>
       <w:r>
-        <w:t>Total:   0.4256s  (Speedup: 0.63x)</w:t>
-      </w:r>
-    </w:p>
-    <w:p>
-      <w:r>
-        <w:t>Map:     0.0550s  (Speedup: 4.89x)</w:t>
-      </w:r>
-    </w:p>
-    <w:p>
-      <w:r>
-        <w:t>Reduce:  0.0002s  (Speedup: 1.17x)</w:t>
+        <w:t xml:space="preserve">Total:   </w:t>
+      </w:r>
+      <w:proofErr w:type="gramStart"/>
+      <w:r>
+        <w:t>0.4256s  (</w:t>
+      </w:r>
+      <w:proofErr w:type="gramEnd"/>
+      <w:r>
+        <w:t>Speedup: 0.63x)</w:t>
+      </w:r>
+    </w:p>
+    <w:p>
+      <w:r>
+        <w:t xml:space="preserve">Map:     </w:t>
+      </w:r>
+      <w:proofErr w:type="gramStart"/>
+      <w:r>
+        <w:t>0.0550s  (</w:t>
+      </w:r>
+      <w:proofErr w:type="gramEnd"/>
+      <w:r>
+        <w:t>Speedup: 4.89x)</w:t>
+      </w:r>
+    </w:p>
+    <w:p>
+      <w:r>
+        <w:t xml:space="preserve">Reduce:  </w:t>
+      </w:r>
+      <w:proofErr w:type="gramStart"/>
+      <w:r>
+        <w:t>0.0002s  (</w:t>
+      </w:r>
+      <w:proofErr w:type="gramEnd"/>
+      <w:r>
+        <w:t>Speedup: 1.17x)</w:t>
       </w:r>
     </w:p>
     <w:p>
@@ -2389,10 +3058,12 @@
       </w:r>
     </w:p>
     <w:p>
+      <w:proofErr w:type="gramStart"/>
       <w:r>
         <w:lastRenderedPageBreak/>
         <w:t>the 10545</w:t>
       </w:r>
+      <w:proofErr w:type="gramEnd"/>
     </w:p>
     <w:p>
       <w:r>
@@ -2483,11 +3154,19 @@
           <w:lang w:val="pl-PL"/>
         </w:rPr>
       </w:pPr>
-      <w:r>
-        <w:rPr>
-          <w:lang w:val="pl-PL"/>
-        </w:rPr>
-        <w:t>session 7288</w:t>
+      <w:proofErr w:type="spellStart"/>
+      <w:r>
+        <w:rPr>
+          <w:lang w:val="pl-PL"/>
+        </w:rPr>
+        <w:t>session</w:t>
+      </w:r>
+      <w:proofErr w:type="spellEnd"/>
+      <w:r>
+        <w:rPr>
+          <w:lang w:val="pl-PL"/>
+        </w:rPr>
+        <w:t xml:space="preserve"> 7288</w:t>
       </w:r>
     </w:p>
     <w:p>
@@ -2512,17 +3191,38 @@
         <w:rPr>
           <w:lang w:val="pl-PL"/>
         </w:rPr>
-        <w:t>medium dataset</w:t>
-      </w:r>
-    </w:p>
-    <w:p>
-      <w:r>
-        <w:t>Dataset: data/medium_dataset</w:t>
-      </w:r>
-    </w:p>
-    <w:p>
-      <w:r>
-        <w:t>Average results for 3 passes of sequential and parallel (with 1, 2 and 4 workers) MAP REDUCE algorithm.</w:t>
+        <w:t xml:space="preserve">medium </w:t>
+      </w:r>
+      <w:proofErr w:type="spellStart"/>
+      <w:r>
+        <w:rPr>
+          <w:lang w:val="pl-PL"/>
+        </w:rPr>
+        <w:t>dataset</w:t>
+      </w:r>
+      <w:proofErr w:type="spellEnd"/>
+    </w:p>
+    <w:p>
+      <w:r>
+        <w:t>Dataset: data/</w:t>
+      </w:r>
+      <w:proofErr w:type="spellStart"/>
+      <w:r>
+        <w:t>medium_dataset</w:t>
+      </w:r>
+      <w:proofErr w:type="spellEnd"/>
+    </w:p>
+    <w:p>
+      <w:r>
+        <w:t xml:space="preserve">Average results for 3 </w:t>
+      </w:r>
+      <w:proofErr w:type="gramStart"/>
+      <w:r>
+        <w:t>passes of sequential and parallel</w:t>
+      </w:r>
+      <w:proofErr w:type="gramEnd"/>
+      <w:r>
+        <w:t xml:space="preserve"> (with 1, 2 and 4 workers) MAP REDUCE algorithm.</w:t>
       </w:r>
     </w:p>
     <w:p/>
@@ -2544,7 +3244,15 @@
     </w:p>
     <w:p>
       <w:r>
-        <w:t>Reduce:  0.0004s</w:t>
+        <w:t>Reduce</w:t>
+      </w:r>
+      <w:proofErr w:type="gramStart"/>
+      <w:r>
+        <w:t>:  0.0004</w:t>
+      </w:r>
+      <w:proofErr w:type="gramEnd"/>
+      <w:r>
+        <w:t>s</w:t>
       </w:r>
     </w:p>
     <w:p/>
@@ -2561,17 +3269,41 @@
     </w:p>
     <w:p>
       <w:r>
-        <w:t>Total:   2.9864s  (Speedup: 0.91x)</w:t>
-      </w:r>
-    </w:p>
-    <w:p>
-      <w:r>
-        <w:t>Map:     2.7278s  (Speedup: 1.00x)</w:t>
-      </w:r>
-    </w:p>
-    <w:p>
-      <w:r>
-        <w:t>Reduce:  0.0004s  (Speedup: 0.94x)</w:t>
+        <w:t xml:space="preserve">Total:   </w:t>
+      </w:r>
+      <w:proofErr w:type="gramStart"/>
+      <w:r>
+        <w:t>2.9864s  (</w:t>
+      </w:r>
+      <w:proofErr w:type="gramEnd"/>
+      <w:r>
+        <w:t>Speedup: 0.91x)</w:t>
+      </w:r>
+    </w:p>
+    <w:p>
+      <w:r>
+        <w:t xml:space="preserve">Map:     </w:t>
+      </w:r>
+      <w:proofErr w:type="gramStart"/>
+      <w:r>
+        <w:t>2.7278s  (</w:t>
+      </w:r>
+      <w:proofErr w:type="gramEnd"/>
+      <w:r>
+        <w:t>Speedup: 1.00x)</w:t>
+      </w:r>
+    </w:p>
+    <w:p>
+      <w:r>
+        <w:t xml:space="preserve">Reduce:  </w:t>
+      </w:r>
+      <w:proofErr w:type="gramStart"/>
+      <w:r>
+        <w:t>0.0004s  (</w:t>
+      </w:r>
+      <w:proofErr w:type="gramEnd"/>
+      <w:r>
+        <w:t>Speedup: 0.94x)</w:t>
       </w:r>
     </w:p>
     <w:p>
@@ -2587,17 +3319,41 @@
     </w:p>
     <w:p>
       <w:r>
-        <w:t>Total:   1.7342s  (Speedup: 1.57x)</w:t>
-      </w:r>
-    </w:p>
-    <w:p>
-      <w:r>
-        <w:t>Map:     1.4407s  (Speedup: 1.89x)</w:t>
-      </w:r>
-    </w:p>
-    <w:p>
-      <w:r>
-        <w:t>Reduce:  0.0004s  (Speedup: 0.96x)</w:t>
+        <w:t xml:space="preserve">Total:   </w:t>
+      </w:r>
+      <w:proofErr w:type="gramStart"/>
+      <w:r>
+        <w:t>1.7342s  (</w:t>
+      </w:r>
+      <w:proofErr w:type="gramEnd"/>
+      <w:r>
+        <w:t>Speedup: 1.57x)</w:t>
+      </w:r>
+    </w:p>
+    <w:p>
+      <w:r>
+        <w:t xml:space="preserve">Map:     </w:t>
+      </w:r>
+      <w:proofErr w:type="gramStart"/>
+      <w:r>
+        <w:t>1.4407s  (</w:t>
+      </w:r>
+      <w:proofErr w:type="gramEnd"/>
+      <w:r>
+        <w:t>Speedup: 1.89x)</w:t>
+      </w:r>
+    </w:p>
+    <w:p>
+      <w:r>
+        <w:t xml:space="preserve">Reduce:  </w:t>
+      </w:r>
+      <w:proofErr w:type="gramStart"/>
+      <w:r>
+        <w:t>0.0004s  (</w:t>
+      </w:r>
+      <w:proofErr w:type="gramEnd"/>
+      <w:r>
+        <w:t>Speedup: 0.96x)</w:t>
       </w:r>
     </w:p>
     <w:p>
@@ -2614,17 +3370,41 @@
     </w:p>
     <w:p>
       <w:r>
-        <w:t>Total:   1.2085s  (Speedup: 2.26x)</w:t>
-      </w:r>
-    </w:p>
-    <w:p>
-      <w:r>
-        <w:t>Map:     0.8533s  (Speedup: 3.19x)</w:t>
-      </w:r>
-    </w:p>
-    <w:p>
-      <w:r>
-        <w:t>Reduce:  0.0004s  (Speedup: 0.98x)</w:t>
+        <w:t xml:space="preserve">Total:   </w:t>
+      </w:r>
+      <w:proofErr w:type="gramStart"/>
+      <w:r>
+        <w:t>1.2085s  (</w:t>
+      </w:r>
+      <w:proofErr w:type="gramEnd"/>
+      <w:r>
+        <w:t>Speedup: 2.26x)</w:t>
+      </w:r>
+    </w:p>
+    <w:p>
+      <w:r>
+        <w:t xml:space="preserve">Map:     </w:t>
+      </w:r>
+      <w:proofErr w:type="gramStart"/>
+      <w:r>
+        <w:t>0.8533s  (</w:t>
+      </w:r>
+      <w:proofErr w:type="gramEnd"/>
+      <w:r>
+        <w:t>Speedup: 3.19x)</w:t>
+      </w:r>
+    </w:p>
+    <w:p>
+      <w:r>
+        <w:t xml:space="preserve">Reduce:  </w:t>
+      </w:r>
+      <w:proofErr w:type="gramStart"/>
+      <w:r>
+        <w:t>0.0004s  (</w:t>
+      </w:r>
+      <w:proofErr w:type="gramEnd"/>
+      <w:r>
+        <w:t>Speedup: 0.98x)</w:t>
       </w:r>
     </w:p>
     <w:p>
@@ -2649,9 +3429,11 @@
       </w:r>
     </w:p>
     <w:p>
+      <w:proofErr w:type="gramStart"/>
       <w:r>
         <w:t>the 107348</w:t>
       </w:r>
+      <w:proofErr w:type="gramEnd"/>
     </w:p>
     <w:p>
       <w:r>
@@ -2684,8 +3466,13 @@
       </w:r>
     </w:p>
     <w:p>
-      <w:r>
-        <w:t>architecture 97199</w:t>
+      <w:proofErr w:type="gramStart"/>
+      <w:r>
+        <w:t>architecture</w:t>
+      </w:r>
+      <w:proofErr w:type="gramEnd"/>
+      <w:r>
+        <w:t xml:space="preserve"> 97199</w:t>
       </w:r>
     </w:p>
     <w:p>
@@ -2734,11 +3521,19 @@
           <w:lang w:val="pl-PL"/>
         </w:rPr>
       </w:pPr>
-      <w:r>
-        <w:rPr>
-          <w:lang w:val="pl-PL"/>
-        </w:rPr>
-        <w:t>session 73054</w:t>
+      <w:proofErr w:type="spellStart"/>
+      <w:r>
+        <w:rPr>
+          <w:lang w:val="pl-PL"/>
+        </w:rPr>
+        <w:t>session</w:t>
+      </w:r>
+      <w:proofErr w:type="spellEnd"/>
+      <w:r>
+        <w:rPr>
+          <w:lang w:val="pl-PL"/>
+        </w:rPr>
+        <w:t xml:space="preserve"> 73054</w:t>
       </w:r>
     </w:p>
     <w:p>
@@ -2765,21 +3560,50 @@
           <w:lang w:val="pl-PL"/>
         </w:rPr>
       </w:pPr>
-      <w:r>
-        <w:rPr>
-          <w:lang w:val="pl-PL"/>
-        </w:rPr>
-        <w:t>large dataset</w:t>
-      </w:r>
-    </w:p>
-    <w:p>
-      <w:r>
-        <w:t>Dataset: data/large_dataset</w:t>
-      </w:r>
-    </w:p>
-    <w:p>
-      <w:r>
-        <w:t>Average results for 3 passes of sequential and parallel (with 1, 2 and 4 workers) MAP REDUCE algorithm.</w:t>
+      <w:proofErr w:type="spellStart"/>
+      <w:r>
+        <w:rPr>
+          <w:lang w:val="pl-PL"/>
+        </w:rPr>
+        <w:t>large</w:t>
+      </w:r>
+      <w:proofErr w:type="spellEnd"/>
+      <w:r>
+        <w:rPr>
+          <w:lang w:val="pl-PL"/>
+        </w:rPr>
+        <w:t xml:space="preserve"> </w:t>
+      </w:r>
+      <w:proofErr w:type="spellStart"/>
+      <w:r>
+        <w:rPr>
+          <w:lang w:val="pl-PL"/>
+        </w:rPr>
+        <w:t>dataset</w:t>
+      </w:r>
+      <w:proofErr w:type="spellEnd"/>
+    </w:p>
+    <w:p>
+      <w:r>
+        <w:t>Dataset: data/</w:t>
+      </w:r>
+      <w:proofErr w:type="spellStart"/>
+      <w:r>
+        <w:t>large_dataset</w:t>
+      </w:r>
+      <w:proofErr w:type="spellEnd"/>
+    </w:p>
+    <w:p>
+      <w:r>
+        <w:t xml:space="preserve">Average results for 3 </w:t>
+      </w:r>
+      <w:proofErr w:type="gramStart"/>
+      <w:r>
+        <w:t>passes of sequential and parallel</w:t>
+      </w:r>
+      <w:proofErr w:type="gramEnd"/>
+      <w:r>
+        <w:t xml:space="preserve"> (with 1, 2 and 4 workers) MAP REDUCE algorithm.</w:t>
       </w:r>
     </w:p>
     <w:p/>
@@ -2801,7 +3625,15 @@
     </w:p>
     <w:p>
       <w:r>
-        <w:t>Reduce:  0.0006s</w:t>
+        <w:t>Reduce</w:t>
+      </w:r>
+      <w:proofErr w:type="gramStart"/>
+      <w:r>
+        <w:t>:  0.0006</w:t>
+      </w:r>
+      <w:proofErr w:type="gramEnd"/>
+      <w:r>
+        <w:t>s</w:t>
       </w:r>
     </w:p>
     <w:p/>
@@ -2818,18 +3650,42 @@
     </w:p>
     <w:p>
       <w:r>
-        <w:t>Total:   9.2099s  (Speedup: 0.96x)</w:t>
-      </w:r>
-    </w:p>
-    <w:p>
-      <w:r>
-        <w:t>Map:     9.0000s  (Speedup: 0.98x)</w:t>
+        <w:t xml:space="preserve">Total:   </w:t>
+      </w:r>
+      <w:proofErr w:type="gramStart"/>
+      <w:r>
+        <w:t>9.2099s  (</w:t>
+      </w:r>
+      <w:proofErr w:type="gramEnd"/>
+      <w:r>
+        <w:t>Speedup: 0.96x)</w:t>
+      </w:r>
+    </w:p>
+    <w:p>
+      <w:r>
+        <w:t xml:space="preserve">Map:     </w:t>
+      </w:r>
+      <w:proofErr w:type="gramStart"/>
+      <w:r>
+        <w:t>9.0000s  (</w:t>
+      </w:r>
+      <w:proofErr w:type="gramEnd"/>
+      <w:r>
+        <w:t>Speedup: 0.98x)</w:t>
       </w:r>
     </w:p>
     <w:p>
       <w:r>
         <w:lastRenderedPageBreak/>
-        <w:t>Reduce:  0.0007s  (Speedup: 0.74x)</w:t>
+        <w:t xml:space="preserve">Reduce:  </w:t>
+      </w:r>
+      <w:proofErr w:type="gramStart"/>
+      <w:r>
+        <w:t>0.0007s  (</w:t>
+      </w:r>
+      <w:proofErr w:type="gramEnd"/>
+      <w:r>
+        <w:t>Speedup: 0.74x)</w:t>
       </w:r>
     </w:p>
     <w:p>
@@ -2845,17 +3701,41 @@
     </w:p>
     <w:p>
       <w:r>
-        <w:t>Total:   5.0043s  (Speedup: 1.77x)</w:t>
-      </w:r>
-    </w:p>
-    <w:p>
-      <w:r>
-        <w:t>Map:     4.7668s  (Speedup: 1.85x)</w:t>
-      </w:r>
-    </w:p>
-    <w:p>
-      <w:r>
-        <w:t>Reduce:  0.0006s  (Speedup: 0.99x)</w:t>
+        <w:t xml:space="preserve">Total:   </w:t>
+      </w:r>
+      <w:proofErr w:type="gramStart"/>
+      <w:r>
+        <w:t>5.0043s  (</w:t>
+      </w:r>
+      <w:proofErr w:type="gramEnd"/>
+      <w:r>
+        <w:t>Speedup: 1.77x)</w:t>
+      </w:r>
+    </w:p>
+    <w:p>
+      <w:r>
+        <w:t xml:space="preserve">Map:     </w:t>
+      </w:r>
+      <w:proofErr w:type="gramStart"/>
+      <w:r>
+        <w:t>4.7668s  (</w:t>
+      </w:r>
+      <w:proofErr w:type="gramEnd"/>
+      <w:r>
+        <w:t>Speedup: 1.85x)</w:t>
+      </w:r>
+    </w:p>
+    <w:p>
+      <w:r>
+        <w:t xml:space="preserve">Reduce:  </w:t>
+      </w:r>
+      <w:proofErr w:type="gramStart"/>
+      <w:r>
+        <w:t>0.0006s  (</w:t>
+      </w:r>
+      <w:proofErr w:type="gramEnd"/>
+      <w:r>
+        <w:t>Speedup: 0.99x)</w:t>
       </w:r>
     </w:p>
     <w:p>
@@ -2871,17 +3751,41 @@
     </w:p>
     <w:p>
       <w:r>
-        <w:t>Total:   2.8303s  (Speedup: 3.12x)</w:t>
-      </w:r>
-    </w:p>
-    <w:p>
-      <w:r>
-        <w:t>Map:     2.5367s  (Speedup: 3.49x)</w:t>
-      </w:r>
-    </w:p>
-    <w:p>
-      <w:r>
-        <w:t>Reduce:  0.0007s  (Speedup: 0.80x)</w:t>
+        <w:t xml:space="preserve">Total:   </w:t>
+      </w:r>
+      <w:proofErr w:type="gramStart"/>
+      <w:r>
+        <w:t>2.8303s  (</w:t>
+      </w:r>
+      <w:proofErr w:type="gramEnd"/>
+      <w:r>
+        <w:t>Speedup: 3.12x)</w:t>
+      </w:r>
+    </w:p>
+    <w:p>
+      <w:r>
+        <w:t xml:space="preserve">Map:     </w:t>
+      </w:r>
+      <w:proofErr w:type="gramStart"/>
+      <w:r>
+        <w:t>2.5367s  (</w:t>
+      </w:r>
+      <w:proofErr w:type="gramEnd"/>
+      <w:r>
+        <w:t>Speedup: 3.49x)</w:t>
+      </w:r>
+    </w:p>
+    <w:p>
+      <w:r>
+        <w:t xml:space="preserve">Reduce:  </w:t>
+      </w:r>
+      <w:proofErr w:type="gramStart"/>
+      <w:r>
+        <w:t>0.0007s  (</w:t>
+      </w:r>
+      <w:proofErr w:type="gramEnd"/>
+      <w:r>
+        <w:t>Speedup: 0.80x)</w:t>
       </w:r>
     </w:p>
     <w:p>
@@ -2906,9 +3810,11 @@
       </w:r>
     </w:p>
     <w:p>
+      <w:proofErr w:type="gramStart"/>
       <w:r>
         <w:t>the 428245</w:t>
       </w:r>
+      <w:proofErr w:type="gramEnd"/>
     </w:p>
     <w:p>
       <w:r>
@@ -3074,7 +3980,49 @@
         <w:rPr>
           <w:lang w:val="pl-PL"/>
         </w:rPr>
-        <w:t>Implementacja MapReduce w Pythonie z użyciem socketów TCP działa poprawnie i umożliwia równoległe przetwarzanie danych</w:t>
+        <w:t xml:space="preserve">Implementacja </w:t>
+      </w:r>
+      <w:proofErr w:type="spellStart"/>
+      <w:r>
+        <w:rPr>
+          <w:lang w:val="pl-PL"/>
+        </w:rPr>
+        <w:t>MapReduce</w:t>
+      </w:r>
+      <w:proofErr w:type="spellEnd"/>
+      <w:r>
+        <w:rPr>
+          <w:lang w:val="pl-PL"/>
+        </w:rPr>
+        <w:t xml:space="preserve"> w </w:t>
+      </w:r>
+      <w:proofErr w:type="spellStart"/>
+      <w:r>
+        <w:rPr>
+          <w:lang w:val="pl-PL"/>
+        </w:rPr>
+        <w:t>Pythonie</w:t>
+      </w:r>
+      <w:proofErr w:type="spellEnd"/>
+      <w:r>
+        <w:rPr>
+          <w:lang w:val="pl-PL"/>
+        </w:rPr>
+        <w:t xml:space="preserve"> z użyciem </w:t>
+      </w:r>
+      <w:proofErr w:type="spellStart"/>
+      <w:r>
+        <w:rPr>
+          <w:lang w:val="pl-PL"/>
+        </w:rPr>
+        <w:t>socketów</w:t>
+      </w:r>
+      <w:proofErr w:type="spellEnd"/>
+      <w:r>
+        <w:rPr>
+          <w:lang w:val="pl-PL"/>
+        </w:rPr>
+        <w:t xml:space="preserve"> TCP działa poprawnie i umożliwia równoległe przetwarzanie danych</w:t>
       </w:r>
     </w:p>
     <w:p>
@@ -3091,7 +4039,21 @@
         <w:rPr>
           <w:lang w:val="pl-PL"/>
         </w:rPr>
-        <w:t>Komunikacja przez TCP zauważalnie wpływa na całkowity czas wykonania programu i gdyby trzeba było przesyłać całe pliki przez sockety (a nie tylko ścieżki) czas oczekiwania na dane wydłużyłby się drastycznie</w:t>
+        <w:t xml:space="preserve">Komunikacja przez TCP zauważalnie wpływa na całkowity czas wykonania programu i gdyby trzeba było przesyłać całe pliki przez </w:t>
+      </w:r>
+      <w:proofErr w:type="spellStart"/>
+      <w:r>
+        <w:rPr>
+          <w:lang w:val="pl-PL"/>
+        </w:rPr>
+        <w:t>sockety</w:t>
+      </w:r>
+      <w:proofErr w:type="spellEnd"/>
+      <w:r>
+        <w:rPr>
+          <w:lang w:val="pl-PL"/>
+        </w:rPr>
+        <w:t xml:space="preserve"> (a nie tylko ścieżki) czas oczekiwania na dane wydłużyłby się drastycznie</w:t>
       </w:r>
     </w:p>
     <w:p>
@@ -3108,7 +4070,21 @@
         <w:rPr>
           <w:lang w:val="pl-PL"/>
         </w:rPr>
-        <w:t>Wzrost liczby workerów skraca czas wykonania, ale tylko do pewnego momentu, ponieważ pojawia się narzut komunikacji sieciowej</w:t>
+        <w:t xml:space="preserve">Wzrost liczby </w:t>
+      </w:r>
+      <w:proofErr w:type="spellStart"/>
+      <w:r>
+        <w:rPr>
+          <w:lang w:val="pl-PL"/>
+        </w:rPr>
+        <w:t>workerów</w:t>
+      </w:r>
+      <w:proofErr w:type="spellEnd"/>
+      <w:r>
+        <w:rPr>
+          <w:lang w:val="pl-PL"/>
+        </w:rPr>
+        <w:t xml:space="preserve"> skraca czas wykonania, ale tylko do pewnego momentu, ponieważ pojawia się narzut komunikacji sieciowej</w:t>
       </w:r>
     </w:p>
     <w:p>
@@ -3121,11 +4097,33 @@
           <w:lang w:val="pl-PL"/>
         </w:rPr>
       </w:pPr>
-      <w:r>
-        <w:rPr>
-          <w:lang w:val="pl-PL"/>
-        </w:rPr>
-        <w:t>Wrost liczby workerów także zmniejsza efektywność</w:t>
+      <w:proofErr w:type="spellStart"/>
+      <w:r>
+        <w:rPr>
+          <w:lang w:val="pl-PL"/>
+        </w:rPr>
+        <w:t>Wrost</w:t>
+      </w:r>
+      <w:proofErr w:type="spellEnd"/>
+      <w:r>
+        <w:rPr>
+          <w:lang w:val="pl-PL"/>
+        </w:rPr>
+        <w:t xml:space="preserve"> liczby </w:t>
+      </w:r>
+      <w:proofErr w:type="spellStart"/>
+      <w:r>
+        <w:rPr>
+          <w:lang w:val="pl-PL"/>
+        </w:rPr>
+        <w:t>workerów</w:t>
+      </w:r>
+      <w:proofErr w:type="spellEnd"/>
+      <w:r>
+        <w:rPr>
+          <w:lang w:val="pl-PL"/>
+        </w:rPr>
+        <w:t xml:space="preserve"> także zmniejsza efektywność</w:t>
       </w:r>
     </w:p>
     <w:p>
@@ -3142,8 +4140,30 @@
         <w:rPr>
           <w:lang w:val="pl-PL"/>
         </w:rPr>
-        <w:t>Wersja sekwencyjna jest dobrym punktem odniesienia do oceny speedup i efficiency</w:t>
-      </w:r>
+        <w:t xml:space="preserve">Wersja sekwencyjna jest dobrym punktem odniesienia do oceny </w:t>
+      </w:r>
+      <w:proofErr w:type="spellStart"/>
+      <w:r>
+        <w:rPr>
+          <w:lang w:val="pl-PL"/>
+        </w:rPr>
+        <w:t>speedup</w:t>
+      </w:r>
+      <w:proofErr w:type="spellEnd"/>
+      <w:r>
+        <w:rPr>
+          <w:lang w:val="pl-PL"/>
+        </w:rPr>
+        <w:t xml:space="preserve"> i </w:t>
+      </w:r>
+      <w:proofErr w:type="spellStart"/>
+      <w:r>
+        <w:rPr>
+          <w:lang w:val="pl-PL"/>
+        </w:rPr>
+        <w:t>efficiency</w:t>
+      </w:r>
+      <w:proofErr w:type="spellEnd"/>
     </w:p>
     <w:p>
       <w:pPr>
@@ -3175,7 +4195,21 @@
         <w:rPr>
           <w:lang w:val="pl-PL"/>
         </w:rPr>
-        <w:t>projekt-mapreduce/</w:t>
+        <w:t>projekt-</w:t>
+      </w:r>
+      <w:proofErr w:type="spellStart"/>
+      <w:r>
+        <w:rPr>
+          <w:lang w:val="pl-PL"/>
+        </w:rPr>
+        <w:t>mapreduce</w:t>
+      </w:r>
+      <w:proofErr w:type="spellEnd"/>
+      <w:r>
+        <w:rPr>
+          <w:lang w:val="pl-PL"/>
+        </w:rPr>
+        <w:t>/</w:t>
       </w:r>
     </w:p>
     <w:p>
@@ -3201,7 +4235,21 @@
         <w:rPr>
           <w:lang w:val="pl-PL"/>
         </w:rPr>
-        <w:t>├── src/</w:t>
+        <w:t xml:space="preserve">├── </w:t>
+      </w:r>
+      <w:proofErr w:type="spellStart"/>
+      <w:r>
+        <w:rPr>
+          <w:lang w:val="pl-PL"/>
+        </w:rPr>
+        <w:t>src</w:t>
+      </w:r>
+      <w:proofErr w:type="spellEnd"/>
+      <w:r>
+        <w:rPr>
+          <w:lang w:val="pl-PL"/>
+        </w:rPr>
+        <w:t>/</w:t>
       </w:r>
     </w:p>
     <w:p>
@@ -3293,12 +4341,14 @@
         </w:rPr>
         <w:t xml:space="preserve">├── </w:t>
       </w:r>
+      <w:proofErr w:type="spellStart"/>
       <w:r>
         <w:rPr>
           <w:lang w:val="pl-PL"/>
         </w:rPr>
         <w:t>docs</w:t>
       </w:r>
+      <w:proofErr w:type="spellEnd"/>
       <w:r>
         <w:rPr>
           <w:lang w:val="pl-PL"/>
@@ -3316,33 +4366,48 @@
         <w:rPr>
           <w:lang w:val="pl-PL"/>
         </w:rPr>
-        <w:t xml:space="preserve">│   └── </w:t>
-      </w:r>
-      <w:r>
-        <w:rPr>
-          <w:lang w:val="pl-PL"/>
-        </w:rPr>
-        <w:t>dokumentacja.docx</w:t>
-      </w:r>
-    </w:p>
-    <w:p>
-      <w:pPr>
-        <w:rPr>
-          <w:lang w:val="pl-PL"/>
-        </w:rPr>
-      </w:pPr>
-      <w:r>
-        <w:rPr>
-          <w:lang w:val="pl-PL"/>
-        </w:rPr>
-        <w:t>├── da</w:t>
-      </w:r>
-      <w:r>
-        <w:rPr>
-          <w:lang w:val="pl-PL"/>
-        </w:rPr>
-        <w:t>ta</w:t>
-      </w:r>
+        <w:t>│   └── dokumentacja.docx</w:t>
+      </w:r>
+    </w:p>
+    <w:p>
+      <w:pPr>
+        <w:rPr>
+          <w:lang w:val="pl-PL"/>
+        </w:rPr>
+      </w:pPr>
+      <w:r>
+        <w:rPr>
+          <w:lang w:val="pl-PL"/>
+        </w:rPr>
+        <w:t>├── data/</w:t>
+      </w:r>
+    </w:p>
+    <w:p>
+      <w:pPr>
+        <w:rPr>
+          <w:lang w:val="pl-PL"/>
+        </w:rPr>
+      </w:pPr>
+      <w:r>
+        <w:rPr>
+          <w:lang w:val="pl-PL"/>
+        </w:rPr>
+        <w:t xml:space="preserve">│   ├── </w:t>
+      </w:r>
+      <w:proofErr w:type="spellStart"/>
+      <w:r>
+        <w:rPr>
+          <w:lang w:val="pl-PL"/>
+        </w:rPr>
+        <w:t>small</w:t>
+      </w:r>
+      <w:r>
+        <w:rPr>
+          <w:lang w:val="pl-PL"/>
+        </w:rPr>
+        <w:t>_dataset</w:t>
+      </w:r>
+      <w:proofErr w:type="spellEnd"/>
       <w:r>
         <w:rPr>
           <w:lang w:val="pl-PL"/>
@@ -3351,48 +4416,33 @@
       </w:r>
     </w:p>
     <w:p>
-      <w:pPr>
-        <w:rPr>
-          <w:lang w:val="pl-PL"/>
-        </w:rPr>
-      </w:pPr>
-      <w:r>
-        <w:rPr>
-          <w:lang w:val="pl-PL"/>
-        </w:rPr>
-        <w:t>│   ├── small</w:t>
-      </w:r>
-      <w:r>
-        <w:rPr>
-          <w:lang w:val="pl-PL"/>
-        </w:rPr>
+      <w:r>
+        <w:t xml:space="preserve">│   ├── </w:t>
+      </w:r>
+      <w:proofErr w:type="spellStart"/>
+      <w:r>
+        <w:t>medium</w:t>
+      </w:r>
+      <w:r>
         <w:t>_dataset</w:t>
       </w:r>
-      <w:r>
-        <w:rPr>
-          <w:lang w:val="pl-PL"/>
-        </w:rPr>
+      <w:proofErr w:type="spellEnd"/>
+      <w:r>
         <w:t>/</w:t>
       </w:r>
     </w:p>
     <w:p>
       <w:r>
-        <w:t>│   ├── medium</w:t>
-      </w:r>
-      <w:r>
-        <w:t>_dataset</w:t>
-      </w:r>
-      <w:r>
-        <w:t>/</w:t>
-      </w:r>
-    </w:p>
-    <w:p>
-      <w:r>
         <w:t>│   ├──</w:t>
       </w:r>
       <w:r>
-        <w:t xml:space="preserve"> large_dataset</w:t>
-      </w:r>
+        <w:t xml:space="preserve"> </w:t>
+      </w:r>
+      <w:proofErr w:type="spellStart"/>
+      <w:r>
+        <w:t>large_dataset</w:t>
+      </w:r>
+      <w:proofErr w:type="spellEnd"/>
       <w:r>
         <w:t>/</w:t>
       </w:r>
@@ -3404,10 +4454,7 @@
         </w:tabs>
       </w:pPr>
       <w:r>
-        <w:t xml:space="preserve">│   ├── </w:t>
-      </w:r>
-      <w:r>
-        <w:t>generate_datasets_and_zip.ps1</w:t>
+        <w:t>│   ├── generate_datasets_and_zip.ps1</w:t>
       </w:r>
     </w:p>
     <w:p>
@@ -3420,25 +4467,28 @@
     </w:p>
     <w:p>
       <w:r>
-        <w:t>├──</w:t>
-      </w:r>
-      <w:r>
-        <w:t xml:space="preserve"> </w:t>
-      </w:r>
-      <w:r>
-        <w:t>.gitattributes</w:t>
-      </w:r>
-    </w:p>
-    <w:p>
-      <w:r>
-        <w:t>├──</w:t>
-      </w:r>
-      <w:r>
-        <w:t xml:space="preserve"> </w:t>
-      </w:r>
-      <w:r>
-        <w:t>.gitignore</w:t>
-      </w:r>
+        <w:t>├── .</w:t>
+      </w:r>
+      <w:proofErr w:type="spellStart"/>
+      <w:r>
+        <w:t>gitattributes</w:t>
+      </w:r>
+      <w:proofErr w:type="spellEnd"/>
+    </w:p>
+    <w:p>
+      <w:r>
+        <w:t>├─</w:t>
+      </w:r>
+      <w:proofErr w:type="gramStart"/>
+      <w:r>
+        <w:t>─ .</w:t>
+      </w:r>
+      <w:proofErr w:type="spellStart"/>
+      <w:r>
+        <w:t>gitignore</w:t>
+      </w:r>
+      <w:proofErr w:type="spellEnd"/>
+      <w:proofErr w:type="gramEnd"/>
     </w:p>
     <w:p>
       <w:r>
@@ -3468,73 +4518,158 @@
     </w:p>
     <w:p>
       <w:pPr>
-        <w:rPr>
-          <w:lang w:val="pl-PL"/>
-        </w:rPr>
-      </w:pPr>
-      <w:r>
-        <w:rPr>
-          <w:lang w:val="pl-PL"/>
-        </w:rPr>
-        <w:t>Wygenerowane d</w:t>
-      </w:r>
-      <w:r>
-        <w:rPr>
-          <w:lang w:val="pl-PL"/>
-        </w:rPr>
-        <w:t xml:space="preserve">atasety </w:t>
-      </w:r>
-      <w:r>
-        <w:rPr>
+        <w:pStyle w:val="ListParagraph"/>
+        <w:numPr>
+          <w:ilvl w:val="0"/>
+          <w:numId w:val="26"/>
+        </w:numPr>
+        <w:rPr>
+          <w:rFonts w:ascii="Arial" w:hAnsi="Arial" w:cs="Arial"/>
+          <w:sz w:val="24"/>
+          <w:szCs w:val="24"/>
+          <w:lang w:val="pl-PL"/>
+        </w:rPr>
+      </w:pPr>
+      <w:r>
+        <w:rPr>
+          <w:rFonts w:ascii="Arial" w:hAnsi="Arial" w:cs="Arial"/>
+          <w:sz w:val="24"/>
+          <w:szCs w:val="24"/>
+          <w:lang w:val="pl-PL"/>
+        </w:rPr>
+        <w:t>Rozpakuj w</w:t>
+      </w:r>
+      <w:r>
+        <w:rPr>
+          <w:rFonts w:ascii="Arial" w:hAnsi="Arial" w:cs="Arial"/>
+          <w:sz w:val="24"/>
+          <w:szCs w:val="24"/>
+          <w:lang w:val="pl-PL"/>
+        </w:rPr>
+        <w:t xml:space="preserve">ygenerowane </w:t>
+      </w:r>
+      <w:proofErr w:type="spellStart"/>
+      <w:r>
+        <w:rPr>
+          <w:rFonts w:ascii="Arial" w:hAnsi="Arial" w:cs="Arial"/>
+          <w:sz w:val="24"/>
+          <w:szCs w:val="24"/>
+          <w:lang w:val="pl-PL"/>
+        </w:rPr>
+        <w:t>d</w:t>
+      </w:r>
+      <w:r>
+        <w:rPr>
+          <w:rFonts w:ascii="Arial" w:hAnsi="Arial" w:cs="Arial"/>
+          <w:sz w:val="24"/>
+          <w:szCs w:val="24"/>
+          <w:lang w:val="pl-PL"/>
+        </w:rPr>
+        <w:t>atasety</w:t>
+      </w:r>
+      <w:proofErr w:type="spellEnd"/>
+      <w:r>
+        <w:rPr>
+          <w:rFonts w:ascii="Arial" w:hAnsi="Arial" w:cs="Arial"/>
+          <w:sz w:val="24"/>
+          <w:szCs w:val="24"/>
+          <w:lang w:val="pl-PL"/>
+        </w:rPr>
+        <w:t xml:space="preserve"> </w:t>
+      </w:r>
+      <w:r>
+        <w:rPr>
+          <w:rFonts w:ascii="Arial" w:hAnsi="Arial" w:cs="Arial"/>
+          <w:sz w:val="24"/>
+          <w:szCs w:val="24"/>
           <w:lang w:val="pl-PL"/>
         </w:rPr>
         <w:t>znajdują się</w:t>
       </w:r>
       <w:r>
         <w:rPr>
+          <w:rFonts w:ascii="Arial" w:hAnsi="Arial" w:cs="Arial"/>
+          <w:sz w:val="24"/>
+          <w:szCs w:val="24"/>
           <w:lang w:val="pl-PL"/>
         </w:rPr>
         <w:t xml:space="preserve"> w folderze </w:t>
       </w:r>
       <w:r>
         <w:rPr>
+          <w:rFonts w:ascii="Arial" w:hAnsi="Arial" w:cs="Arial"/>
           <w:b/>
           <w:bCs/>
+          <w:sz w:val="24"/>
+          <w:szCs w:val="24"/>
           <w:lang w:val="pl-PL"/>
         </w:rPr>
         <w:t>data/</w:t>
       </w:r>
-      <w:r>
-        <w:rPr>
-          <w:lang w:val="pl-PL"/>
-        </w:rPr>
-        <w:br/>
-      </w:r>
-      <w:r>
-        <w:rPr>
-          <w:lang w:val="pl-PL"/>
-        </w:rPr>
-        <w:br/>
+    </w:p>
+    <w:p>
+      <w:pPr>
+        <w:pStyle w:val="ListParagraph"/>
+        <w:numPr>
+          <w:ilvl w:val="0"/>
+          <w:numId w:val="26"/>
+        </w:numPr>
+        <w:rPr>
+          <w:rFonts w:ascii="Arial" w:hAnsi="Arial" w:cs="Arial"/>
+          <w:sz w:val="24"/>
+          <w:szCs w:val="24"/>
+          <w:lang w:val="pl-PL"/>
+        </w:rPr>
+      </w:pPr>
+      <w:r>
+        <w:rPr>
+          <w:rFonts w:ascii="Arial" w:hAnsi="Arial" w:cs="Arial"/>
+          <w:sz w:val="24"/>
+          <w:szCs w:val="24"/>
+          <w:lang w:val="pl-PL"/>
+        </w:rPr>
         <w:t xml:space="preserve">Aby uruchomić projekt wystarczy wejść w folder </w:t>
       </w:r>
-      <w:r>
-        <w:rPr>
+      <w:proofErr w:type="spellStart"/>
+      <w:r>
+        <w:rPr>
+          <w:rFonts w:ascii="Arial" w:hAnsi="Arial" w:cs="Arial"/>
           <w:b/>
           <w:bCs/>
-          <w:lang w:val="pl-PL"/>
-        </w:rPr>
-        <w:t>src/</w:t>
-      </w:r>
-      <w:r>
-        <w:rPr>
-          <w:lang w:val="pl-PL"/>
-        </w:rPr>
-        <w:t xml:space="preserve"> i uruchomić </w:t>
-      </w:r>
-      <w:r>
-        <w:rPr>
+          <w:sz w:val="24"/>
+          <w:szCs w:val="24"/>
+          <w:lang w:val="pl-PL"/>
+        </w:rPr>
+        <w:t>src</w:t>
+      </w:r>
+      <w:proofErr w:type="spellEnd"/>
+      <w:r>
+        <w:rPr>
+          <w:rFonts w:ascii="Arial" w:hAnsi="Arial" w:cs="Arial"/>
           <w:b/>
           <w:bCs/>
+          <w:sz w:val="24"/>
+          <w:szCs w:val="24"/>
+          <w:lang w:val="pl-PL"/>
+        </w:rPr>
+        <w:t>/</w:t>
+      </w:r>
+      <w:r>
+        <w:rPr>
+          <w:rFonts w:ascii="Arial" w:hAnsi="Arial" w:cs="Arial"/>
+          <w:sz w:val="24"/>
+          <w:szCs w:val="24"/>
+          <w:lang w:val="pl-PL"/>
+        </w:rPr>
+        <w:t xml:space="preserve"> i uruchomić </w:t>
+      </w:r>
+      <w:r>
+        <w:rPr>
+          <w:rFonts w:ascii="Arial" w:hAnsi="Arial" w:cs="Arial"/>
+          <w:b/>
+          <w:bCs/>
+          <w:sz w:val="24"/>
+          <w:szCs w:val="24"/>
           <w:lang w:val="pl-PL"/>
         </w:rPr>
         <w:t>benchmark.py</w:t>
@@ -3542,21 +4677,30 @@
     </w:p>
     <w:p>
       <w:pPr>
-        <w:rPr>
-          <w:lang w:val="pl-PL"/>
-        </w:rPr>
-      </w:pPr>
-      <w:r>
-        <w:rPr>
-          <w:lang w:val="pl-PL"/>
-        </w:rPr>
-        <w:br/>
-      </w:r>
-      <w:r>
-        <w:rPr>
-          <w:lang w:val="pl-PL"/>
-        </w:rPr>
-        <w:t>Aby wygenerować nowy dataset należy użyć generatora i upewnić się</w:t>
+        <w:ind w:left="360"/>
+        <w:rPr>
+          <w:lang w:val="pl-PL"/>
+        </w:rPr>
+      </w:pPr>
+      <w:r>
+        <w:rPr>
+          <w:lang w:val="pl-PL"/>
+        </w:rPr>
+        <w:t xml:space="preserve">Aby wygenerować nowy </w:t>
+      </w:r>
+      <w:proofErr w:type="spellStart"/>
+      <w:r>
+        <w:rPr>
+          <w:lang w:val="pl-PL"/>
+        </w:rPr>
+        <w:t>dataset</w:t>
+      </w:r>
+      <w:proofErr w:type="spellEnd"/>
+      <w:r>
+        <w:rPr>
+          <w:lang w:val="pl-PL"/>
+        </w:rPr>
+        <w:t xml:space="preserve"> należy użyć generatora i upewnić się</w:t>
       </w:r>
       <w:r>
         <w:rPr>
@@ -5254,6 +6398,119 @@
     </w:lvl>
   </w:abstractNum>
   <w:abstractNum w:abstractNumId="14" w15:restartNumberingAfterBreak="0">
+    <w:nsid w:val="3FF31C2F"/>
+    <w:multiLevelType w:val="hybridMultilevel"/>
+    <w:tmpl w:val="F8463F5C"/>
+    <w:lvl w:ilvl="0" w:tplc="04090001">
+      <w:start w:val="1"/>
+      <w:numFmt w:val="bullet"/>
+      <w:lvlText w:val=""/>
+      <w:lvlJc w:val="left"/>
+      <w:pPr>
+        <w:ind w:left="720" w:hanging="360"/>
+      </w:pPr>
+      <w:rPr>
+        <w:rFonts w:ascii="Symbol" w:hAnsi="Symbol" w:hint="default"/>
+      </w:rPr>
+    </w:lvl>
+    <w:lvl w:ilvl="1" w:tplc="04090003" w:tentative="1">
+      <w:start w:val="1"/>
+      <w:numFmt w:val="bullet"/>
+      <w:lvlText w:val="o"/>
+      <w:lvlJc w:val="left"/>
+      <w:pPr>
+        <w:ind w:left="1440" w:hanging="360"/>
+      </w:pPr>
+      <w:rPr>
+        <w:rFonts w:ascii="Courier New" w:hAnsi="Courier New" w:cs="Courier New" w:hint="default"/>
+      </w:rPr>
+    </w:lvl>
+    <w:lvl w:ilvl="2" w:tplc="04090005" w:tentative="1">
+      <w:start w:val="1"/>
+      <w:numFmt w:val="bullet"/>
+      <w:lvlText w:val=""/>
+      <w:lvlJc w:val="left"/>
+      <w:pPr>
+        <w:ind w:left="2160" w:hanging="360"/>
+      </w:pPr>
+      <w:rPr>
+        <w:rFonts w:ascii="Wingdings" w:hAnsi="Wingdings" w:hint="default"/>
+      </w:rPr>
+    </w:lvl>
+    <w:lvl w:ilvl="3" w:tplc="04090001" w:tentative="1">
+      <w:start w:val="1"/>
+      <w:numFmt w:val="bullet"/>
+      <w:lvlText w:val=""/>
+      <w:lvlJc w:val="left"/>
+      <w:pPr>
+        <w:ind w:left="2880" w:hanging="360"/>
+      </w:pPr>
+      <w:rPr>
+        <w:rFonts w:ascii="Symbol" w:hAnsi="Symbol" w:hint="default"/>
+      </w:rPr>
+    </w:lvl>
+    <w:lvl w:ilvl="4" w:tplc="04090003" w:tentative="1">
+      <w:start w:val="1"/>
+      <w:numFmt w:val="bullet"/>
+      <w:lvlText w:val="o"/>
+      <w:lvlJc w:val="left"/>
+      <w:pPr>
+        <w:ind w:left="3600" w:hanging="360"/>
+      </w:pPr>
+      <w:rPr>
+        <w:rFonts w:ascii="Courier New" w:hAnsi="Courier New" w:cs="Courier New" w:hint="default"/>
+      </w:rPr>
+    </w:lvl>
+    <w:lvl w:ilvl="5" w:tplc="04090005" w:tentative="1">
+      <w:start w:val="1"/>
+      <w:numFmt w:val="bullet"/>
+      <w:lvlText w:val=""/>
+      <w:lvlJc w:val="left"/>
+      <w:pPr>
+        <w:ind w:left="4320" w:hanging="360"/>
+      </w:pPr>
+      <w:rPr>
+        <w:rFonts w:ascii="Wingdings" w:hAnsi="Wingdings" w:hint="default"/>
+      </w:rPr>
+    </w:lvl>
+    <w:lvl w:ilvl="6" w:tplc="04090001" w:tentative="1">
+      <w:start w:val="1"/>
+      <w:numFmt w:val="bullet"/>
+      <w:lvlText w:val=""/>
+      <w:lvlJc w:val="left"/>
+      <w:pPr>
+        <w:ind w:left="5040" w:hanging="360"/>
+      </w:pPr>
+      <w:rPr>
+        <w:rFonts w:ascii="Symbol" w:hAnsi="Symbol" w:hint="default"/>
+      </w:rPr>
+    </w:lvl>
+    <w:lvl w:ilvl="7" w:tplc="04090003" w:tentative="1">
+      <w:start w:val="1"/>
+      <w:numFmt w:val="bullet"/>
+      <w:lvlText w:val="o"/>
+      <w:lvlJc w:val="left"/>
+      <w:pPr>
+        <w:ind w:left="5760" w:hanging="360"/>
+      </w:pPr>
+      <w:rPr>
+        <w:rFonts w:ascii="Courier New" w:hAnsi="Courier New" w:cs="Courier New" w:hint="default"/>
+      </w:rPr>
+    </w:lvl>
+    <w:lvl w:ilvl="8" w:tplc="04090005" w:tentative="1">
+      <w:start w:val="1"/>
+      <w:numFmt w:val="bullet"/>
+      <w:lvlText w:val=""/>
+      <w:lvlJc w:val="left"/>
+      <w:pPr>
+        <w:ind w:left="6480" w:hanging="360"/>
+      </w:pPr>
+      <w:rPr>
+        <w:rFonts w:ascii="Wingdings" w:hAnsi="Wingdings" w:hint="default"/>
+      </w:rPr>
+    </w:lvl>
+  </w:abstractNum>
+  <w:abstractNum w:abstractNumId="15" w15:restartNumberingAfterBreak="0">
     <w:nsid w:val="40971E04"/>
     <w:multiLevelType w:val="hybridMultilevel"/>
     <w:tmpl w:val="82B600EC"/>
@@ -5339,7 +6596,7 @@
       </w:pPr>
     </w:lvl>
   </w:abstractNum>
-  <w:abstractNum w:abstractNumId="15" w15:restartNumberingAfterBreak="0">
+  <w:abstractNum w:abstractNumId="16" w15:restartNumberingAfterBreak="0">
     <w:nsid w:val="45FB019C"/>
     <w:multiLevelType w:val="hybridMultilevel"/>
     <w:tmpl w:val="C9A8B522"/>
@@ -5452,7 +6709,7 @@
       </w:rPr>
     </w:lvl>
   </w:abstractNum>
-  <w:abstractNum w:abstractNumId="16" w15:restartNumberingAfterBreak="0">
+  <w:abstractNum w:abstractNumId="17" w15:restartNumberingAfterBreak="0">
     <w:nsid w:val="480F3A94"/>
     <w:multiLevelType w:val="multilevel"/>
     <w:tmpl w:val="9C421BDE"/>
@@ -5565,7 +6822,7 @@
       </w:rPr>
     </w:lvl>
   </w:abstractNum>
-  <w:abstractNum w:abstractNumId="17" w15:restartNumberingAfterBreak="0">
+  <w:abstractNum w:abstractNumId="18" w15:restartNumberingAfterBreak="0">
     <w:nsid w:val="48D37FB4"/>
     <w:multiLevelType w:val="multilevel"/>
     <w:tmpl w:val="8898D642"/>
@@ -5678,7 +6935,7 @@
       </w:rPr>
     </w:lvl>
   </w:abstractNum>
-  <w:abstractNum w:abstractNumId="18" w15:restartNumberingAfterBreak="0">
+  <w:abstractNum w:abstractNumId="19" w15:restartNumberingAfterBreak="0">
     <w:nsid w:val="4BDE4269"/>
     <w:multiLevelType w:val="multilevel"/>
     <w:tmpl w:val="8898D642"/>
@@ -5791,7 +7048,7 @@
       </w:rPr>
     </w:lvl>
   </w:abstractNum>
-  <w:abstractNum w:abstractNumId="19" w15:restartNumberingAfterBreak="0">
+  <w:abstractNum w:abstractNumId="20" w15:restartNumberingAfterBreak="0">
     <w:nsid w:val="50B57110"/>
     <w:multiLevelType w:val="multilevel"/>
     <w:tmpl w:val="8898D642"/>
@@ -5904,7 +7161,7 @@
       </w:rPr>
     </w:lvl>
   </w:abstractNum>
-  <w:abstractNum w:abstractNumId="20" w15:restartNumberingAfterBreak="0">
+  <w:abstractNum w:abstractNumId="21" w15:restartNumberingAfterBreak="0">
     <w:nsid w:val="5AD44749"/>
     <w:multiLevelType w:val="multilevel"/>
     <w:tmpl w:val="8898D642"/>
@@ -6017,7 +7274,7 @@
       </w:rPr>
     </w:lvl>
   </w:abstractNum>
-  <w:abstractNum w:abstractNumId="21" w15:restartNumberingAfterBreak="0">
+  <w:abstractNum w:abstractNumId="22" w15:restartNumberingAfterBreak="0">
     <w:nsid w:val="5C1F5368"/>
     <w:multiLevelType w:val="hybridMultilevel"/>
     <w:tmpl w:val="E6363B96"/>
@@ -6130,7 +7387,7 @@
       </w:rPr>
     </w:lvl>
   </w:abstractNum>
-  <w:abstractNum w:abstractNumId="22" w15:restartNumberingAfterBreak="0">
+  <w:abstractNum w:abstractNumId="23" w15:restartNumberingAfterBreak="0">
     <w:nsid w:val="6A580B25"/>
     <w:multiLevelType w:val="hybridMultilevel"/>
     <w:tmpl w:val="727A0E64"/>
@@ -6243,7 +7500,7 @@
       </w:rPr>
     </w:lvl>
   </w:abstractNum>
-  <w:abstractNum w:abstractNumId="23" w15:restartNumberingAfterBreak="0">
+  <w:abstractNum w:abstractNumId="24" w15:restartNumberingAfterBreak="0">
     <w:nsid w:val="70287043"/>
     <w:multiLevelType w:val="hybridMultilevel"/>
     <w:tmpl w:val="348C6EF6"/>
@@ -6356,7 +7613,7 @@
       </w:rPr>
     </w:lvl>
   </w:abstractNum>
-  <w:abstractNum w:abstractNumId="24" w15:restartNumberingAfterBreak="0">
+  <w:abstractNum w:abstractNumId="25" w15:restartNumberingAfterBreak="0">
     <w:nsid w:val="732825C3"/>
     <w:multiLevelType w:val="hybridMultilevel"/>
     <w:tmpl w:val="EA64AC50"/>
@@ -6443,13 +7700,13 @@
     </w:lvl>
   </w:abstractNum>
   <w:num w:numId="1" w16cid:durableId="967708484">
-    <w:abstractNumId w:val="20"/>
+    <w:abstractNumId w:val="21"/>
   </w:num>
   <w:num w:numId="2" w16cid:durableId="750586507">
     <w:abstractNumId w:val="13"/>
   </w:num>
   <w:num w:numId="3" w16cid:durableId="754595191">
-    <w:abstractNumId w:val="16"/>
+    <w:abstractNumId w:val="17"/>
   </w:num>
   <w:num w:numId="4" w16cid:durableId="112596342">
     <w:abstractNumId w:val="4"/>
@@ -6461,16 +7718,16 @@
     <w:abstractNumId w:val="3"/>
   </w:num>
   <w:num w:numId="7" w16cid:durableId="249658565">
-    <w:abstractNumId w:val="22"/>
+    <w:abstractNumId w:val="23"/>
   </w:num>
   <w:num w:numId="8" w16cid:durableId="690763299">
     <w:abstractNumId w:val="10"/>
   </w:num>
   <w:num w:numId="9" w16cid:durableId="388001291">
-    <w:abstractNumId w:val="24"/>
+    <w:abstractNumId w:val="25"/>
   </w:num>
   <w:num w:numId="10" w16cid:durableId="2133358307">
-    <w:abstractNumId w:val="14"/>
+    <w:abstractNumId w:val="15"/>
   </w:num>
   <w:num w:numId="11" w16cid:durableId="1977026910">
     <w:abstractNumId w:val="2"/>
@@ -6479,22 +7736,22 @@
     <w:abstractNumId w:val="1"/>
   </w:num>
   <w:num w:numId="13" w16cid:durableId="1322586761">
-    <w:abstractNumId w:val="15"/>
+    <w:abstractNumId w:val="16"/>
   </w:num>
   <w:num w:numId="14" w16cid:durableId="436488431">
     <w:abstractNumId w:val="12"/>
   </w:num>
   <w:num w:numId="15" w16cid:durableId="504395478">
-    <w:abstractNumId w:val="19"/>
+    <w:abstractNumId w:val="20"/>
   </w:num>
   <w:num w:numId="16" w16cid:durableId="1373117246">
-    <w:abstractNumId w:val="18"/>
+    <w:abstractNumId w:val="19"/>
   </w:num>
   <w:num w:numId="17" w16cid:durableId="1000742763">
     <w:abstractNumId w:val="5"/>
   </w:num>
   <w:num w:numId="18" w16cid:durableId="1427964450">
-    <w:abstractNumId w:val="23"/>
+    <w:abstractNumId w:val="24"/>
   </w:num>
   <w:num w:numId="19" w16cid:durableId="240066035">
     <w:abstractNumId w:val="11"/>
@@ -6503,7 +7760,7 @@
     <w:abstractNumId w:val="8"/>
   </w:num>
   <w:num w:numId="21" w16cid:durableId="595286264">
-    <w:abstractNumId w:val="21"/>
+    <w:abstractNumId w:val="22"/>
   </w:num>
   <w:num w:numId="22" w16cid:durableId="1816877159">
     <w:abstractNumId w:val="9"/>
@@ -6512,10 +7769,13 @@
     <w:abstractNumId w:val="7"/>
   </w:num>
   <w:num w:numId="24" w16cid:durableId="1481382141">
-    <w:abstractNumId w:val="17"/>
+    <w:abstractNumId w:val="18"/>
   </w:num>
   <w:num w:numId="25" w16cid:durableId="855967984">
     <w:abstractNumId w:val="0"/>
+  </w:num>
+  <w:num w:numId="26" w16cid:durableId="644044006">
+    <w:abstractNumId w:val="14"/>
   </w:num>
 </w:numbering>
 </file>
@@ -6967,6 +8227,7 @@
   <w:style w:type="character" w:default="1" w:styleId="DefaultParagraphFont">
     <w:name w:val="Default Paragraph Font"/>
     <w:uiPriority w:val="1"/>
+    <w:semiHidden/>
     <w:unhideWhenUsed/>
   </w:style>
   <w:style w:type="table" w:default="1" w:styleId="TableNormal">
@@ -6974,7 +8235,6 @@
     <w:uiPriority w:val="99"/>
     <w:semiHidden/>
     <w:unhideWhenUsed/>
-    <w:qFormat/>
     <w:tblPr>
       <w:tblInd w:w="0" w:type="dxa"/>
       <w:tblCellMar>

</xml_diff>